<commit_message>
Contract pack: acceptance certificates, hypercare exit, escrow, exit plan and service catalogue (in progress)
</commit_message>
<xml_diff>
--- a/docs/package/out/contracts/iNXT_BrokerVerse_Annual_Maintenance_Support_and_SLA.docx
+++ b/docs/package/out/contracts/iNXT_BrokerVerse_Annual_Maintenance_Support_and_SLA.docx
@@ -789,7 +789,7 @@
             </w:rPr>
             <w:fldChar w:fldCharType="separate"/>
           </w:r>
-          <w:hyperlink w:anchor="__RefHeading___Toc18915_1603226370">
+          <w:hyperlink w:anchor="__RefHeading___Toc38060_2679730275">
             <w:r>
               <w:rPr>
                 <w:webHidden/>
@@ -824,7 +824,7 @@
             </w:tabs>
             <w:rPr/>
           </w:pPr>
-          <w:hyperlink w:anchor="__RefHeading___Toc18917_1603226370">
+          <w:hyperlink w:anchor="__RefHeading___Toc38062_2679730275">
             <w:r>
               <w:rPr>
                 <w:webHidden/>
@@ -853,7 +853,7 @@
             </w:tabs>
             <w:rPr/>
           </w:pPr>
-          <w:hyperlink w:anchor="__RefHeading___Toc18919_1603226370">
+          <w:hyperlink w:anchor="__RefHeading___Toc38064_2679730275">
             <w:r>
               <w:rPr>
                 <w:webHidden/>
@@ -875,7 +875,7 @@
             </w:tabs>
             <w:rPr/>
           </w:pPr>
-          <w:hyperlink w:anchor="__RefHeading___Toc18921_1603226370">
+          <w:hyperlink w:anchor="__RefHeading___Toc38066_2679730275">
             <w:r>
               <w:rPr>
                 <w:webHidden/>
@@ -897,7 +897,7 @@
             </w:tabs>
             <w:rPr/>
           </w:pPr>
-          <w:hyperlink w:anchor="__RefHeading___Toc18923_1603226370">
+          <w:hyperlink w:anchor="__RefHeading___Toc38068_2679730275">
             <w:r>
               <w:rPr>
                 <w:webHidden/>
@@ -919,7 +919,7 @@
             </w:tabs>
             <w:rPr/>
           </w:pPr>
-          <w:hyperlink w:anchor="__RefHeading___Toc18925_1603226370">
+          <w:hyperlink w:anchor="__RefHeading___Toc38070_2679730275">
             <w:r>
               <w:rPr>
                 <w:webHidden/>
@@ -941,7 +941,7 @@
             </w:tabs>
             <w:rPr/>
           </w:pPr>
-          <w:hyperlink w:anchor="__RefHeading___Toc18927_1603226370">
+          <w:hyperlink w:anchor="__RefHeading___Toc38072_2679730275">
             <w:r>
               <w:rPr>
                 <w:webHidden/>
@@ -963,7 +963,7 @@
             </w:tabs>
             <w:rPr/>
           </w:pPr>
-          <w:hyperlink w:anchor="__RefHeading___Toc18929_1603226370">
+          <w:hyperlink w:anchor="__RefHeading___Toc38074_2679730275">
             <w:r>
               <w:rPr>
                 <w:webHidden/>
@@ -985,7 +985,7 @@
             </w:tabs>
             <w:rPr/>
           </w:pPr>
-          <w:hyperlink w:anchor="__RefHeading___Toc18931_1603226370">
+          <w:hyperlink w:anchor="__RefHeading___Toc38076_2679730275">
             <w:r>
               <w:rPr>
                 <w:webHidden/>
@@ -1007,7 +1007,7 @@
             </w:tabs>
             <w:rPr/>
           </w:pPr>
-          <w:hyperlink w:anchor="__RefHeading___Toc18933_1603226370">
+          <w:hyperlink w:anchor="__RefHeading___Toc38078_2679730275">
             <w:r>
               <w:rPr>
                 <w:webHidden/>
@@ -1029,7 +1029,7 @@
             </w:tabs>
             <w:rPr/>
           </w:pPr>
-          <w:hyperlink w:anchor="__RefHeading___Toc18935_1603226370">
+          <w:hyperlink w:anchor="__RefHeading___Toc38080_2679730275">
             <w:r>
               <w:rPr>
                 <w:webHidden/>
@@ -1051,7 +1051,7 @@
             </w:tabs>
             <w:rPr/>
           </w:pPr>
-          <w:hyperlink w:anchor="__RefHeading___Toc18937_1603226370">
+          <w:hyperlink w:anchor="__RefHeading___Toc38082_2679730275">
             <w:r>
               <w:rPr>
                 <w:webHidden/>
@@ -1073,7 +1073,7 @@
             </w:tabs>
             <w:rPr/>
           </w:pPr>
-          <w:hyperlink w:anchor="__RefHeading___Toc18939_1603226370">
+          <w:hyperlink w:anchor="__RefHeading___Toc38084_2679730275">
             <w:r>
               <w:rPr>
                 <w:webHidden/>
@@ -1095,7 +1095,7 @@
             </w:tabs>
             <w:rPr/>
           </w:pPr>
-          <w:hyperlink w:anchor="__RefHeading___Toc18941_1603226370">
+          <w:hyperlink w:anchor="__RefHeading___Toc38086_2679730275">
             <w:r>
               <w:rPr>
                 <w:webHidden/>
@@ -1117,7 +1117,7 @@
             </w:tabs>
             <w:rPr/>
           </w:pPr>
-          <w:hyperlink w:anchor="__RefHeading___Toc18943_1603226370">
+          <w:hyperlink w:anchor="__RefHeading___Toc38088_2679730275">
             <w:r>
               <w:rPr>
                 <w:webHidden/>
@@ -1139,7 +1139,7 @@
             </w:tabs>
             <w:rPr/>
           </w:pPr>
-          <w:hyperlink w:anchor="__RefHeading___Toc18945_1603226370">
+          <w:hyperlink w:anchor="__RefHeading___Toc38090_2679730275">
             <w:r>
               <w:rPr>
                 <w:webHidden/>
@@ -1161,7 +1161,7 @@
             </w:tabs>
             <w:rPr/>
           </w:pPr>
-          <w:hyperlink w:anchor="__RefHeading___Toc18947_1603226370">
+          <w:hyperlink w:anchor="__RefHeading___Toc38092_2679730275">
             <w:r>
               <w:rPr>
                 <w:webHidden/>
@@ -1183,7 +1183,7 @@
             </w:tabs>
             <w:rPr/>
           </w:pPr>
-          <w:hyperlink w:anchor="__RefHeading___Toc18949_1603226370">
+          <w:hyperlink w:anchor="__RefHeading___Toc38094_2679730275">
             <w:r>
               <w:rPr>
                 <w:webHidden/>
@@ -1205,7 +1205,7 @@
             </w:tabs>
             <w:rPr/>
           </w:pPr>
-          <w:hyperlink w:anchor="__RefHeading___Toc18951_1603226370">
+          <w:hyperlink w:anchor="__RefHeading___Toc38096_2679730275">
             <w:r>
               <w:rPr>
                 <w:webHidden/>
@@ -1227,7 +1227,7 @@
             </w:tabs>
             <w:rPr/>
           </w:pPr>
-          <w:hyperlink w:anchor="__RefHeading___Toc18953_1603226370">
+          <w:hyperlink w:anchor="__RefHeading___Toc38098_2679730275">
             <w:r>
               <w:rPr>
                 <w:webHidden/>
@@ -1249,7 +1249,7 @@
             </w:tabs>
             <w:rPr/>
           </w:pPr>
-          <w:hyperlink w:anchor="__RefHeading___Toc18955_1603226370">
+          <w:hyperlink w:anchor="__RefHeading___Toc38100_2679730275">
             <w:r>
               <w:rPr>
                 <w:webHidden/>
@@ -1271,7 +1271,7 @@
             </w:tabs>
             <w:rPr/>
           </w:pPr>
-          <w:hyperlink w:anchor="__RefHeading___Toc18957_1603226370">
+          <w:hyperlink w:anchor="__RefHeading___Toc38102_2679730275">
             <w:r>
               <w:rPr>
                 <w:webHidden/>
@@ -1293,7 +1293,7 @@
             </w:tabs>
             <w:rPr/>
           </w:pPr>
-          <w:hyperlink w:anchor="__RefHeading___Toc18959_1603226370">
+          <w:hyperlink w:anchor="__RefHeading___Toc38104_2679730275">
             <w:r>
               <w:rPr>
                 <w:webHidden/>
@@ -1315,7 +1315,7 @@
             </w:tabs>
             <w:rPr/>
           </w:pPr>
-          <w:hyperlink w:anchor="__RefHeading___Toc18961_1603226370">
+          <w:hyperlink w:anchor="__RefHeading___Toc38106_2679730275">
             <w:r>
               <w:rPr>
                 <w:webHidden/>
@@ -1337,7 +1337,7 @@
             </w:tabs>
             <w:rPr/>
           </w:pPr>
-          <w:hyperlink w:anchor="__RefHeading___Toc18963_1603226370">
+          <w:hyperlink w:anchor="__RefHeading___Toc38108_2679730275">
             <w:r>
               <w:rPr>
                 <w:webHidden/>
@@ -1359,7 +1359,7 @@
             </w:tabs>
             <w:rPr/>
           </w:pPr>
-          <w:hyperlink w:anchor="__RefHeading___Toc18965_1603226370">
+          <w:hyperlink w:anchor="__RefHeading___Toc38110_2679730275">
             <w:r>
               <w:rPr>
                 <w:webHidden/>
@@ -1381,7 +1381,7 @@
             </w:tabs>
             <w:rPr/>
           </w:pPr>
-          <w:hyperlink w:anchor="__RefHeading___Toc18967_1603226370">
+          <w:hyperlink w:anchor="__RefHeading___Toc38112_2679730275">
             <w:r>
               <w:rPr>
                 <w:webHidden/>
@@ -1403,7 +1403,7 @@
             </w:tabs>
             <w:rPr/>
           </w:pPr>
-          <w:hyperlink w:anchor="__RefHeading___Toc18969_1603226370">
+          <w:hyperlink w:anchor="__RefHeading___Toc38114_2679730275">
             <w:r>
               <w:rPr>
                 <w:webHidden/>
@@ -1425,7 +1425,7 @@
             </w:tabs>
             <w:rPr/>
           </w:pPr>
-          <w:hyperlink w:anchor="__RefHeading___Toc18971_1603226370">
+          <w:hyperlink w:anchor="__RefHeading___Toc38116_2679730275">
             <w:r>
               <w:rPr>
                 <w:webHidden/>
@@ -1447,7 +1447,7 @@
             </w:tabs>
             <w:rPr/>
           </w:pPr>
-          <w:hyperlink w:anchor="__RefHeading___Toc18973_1603226370">
+          <w:hyperlink w:anchor="__RefHeading___Toc38118_2679730275">
             <w:r>
               <w:rPr>
                 <w:webHidden/>
@@ -1469,7 +1469,7 @@
             </w:tabs>
             <w:rPr/>
           </w:pPr>
-          <w:hyperlink w:anchor="__RefHeading___Toc18975_1603226370">
+          <w:hyperlink w:anchor="__RefHeading___Toc38120_2679730275">
             <w:r>
               <w:rPr>
                 <w:webHidden/>
@@ -1491,7 +1491,7 @@
             </w:tabs>
             <w:rPr/>
           </w:pPr>
-          <w:hyperlink w:anchor="__RefHeading___Toc18977_1603226370">
+          <w:hyperlink w:anchor="__RefHeading___Toc38122_2679730275">
             <w:r>
               <w:rPr>
                 <w:webHidden/>
@@ -1513,7 +1513,7 @@
             </w:tabs>
             <w:rPr/>
           </w:pPr>
-          <w:hyperlink w:anchor="__RefHeading___Toc18979_1603226370">
+          <w:hyperlink w:anchor="__RefHeading___Toc38124_2679730275">
             <w:r>
               <w:rPr>
                 <w:webHidden/>
@@ -1535,7 +1535,7 @@
             </w:tabs>
             <w:rPr/>
           </w:pPr>
-          <w:hyperlink w:anchor="__RefHeading___Toc18981_1603226370">
+          <w:hyperlink w:anchor="__RefHeading___Toc38126_2679730275">
             <w:r>
               <w:rPr>
                 <w:webHidden/>
@@ -1557,7 +1557,7 @@
             </w:tabs>
             <w:rPr/>
           </w:pPr>
-          <w:hyperlink w:anchor="__RefHeading___Toc18983_1603226370">
+          <w:hyperlink w:anchor="__RefHeading___Toc38128_2679730275">
             <w:r>
               <w:rPr>
                 <w:webHidden/>
@@ -1579,7 +1579,7 @@
             </w:tabs>
             <w:rPr/>
           </w:pPr>
-          <w:hyperlink w:anchor="__RefHeading___Toc18985_1603226370">
+          <w:hyperlink w:anchor="__RefHeading___Toc38130_2679730275">
             <w:r>
               <w:rPr>
                 <w:webHidden/>
@@ -1601,7 +1601,7 @@
             </w:tabs>
             <w:rPr/>
           </w:pPr>
-          <w:hyperlink w:anchor="__RefHeading___Toc18987_1603226370">
+          <w:hyperlink w:anchor="__RefHeading___Toc38132_2679730275">
             <w:r>
               <w:rPr>
                 <w:webHidden/>
@@ -1649,7 +1649,7 @@
       <w:r>
         <w:br w:type="page"/>
       </w:r>
-      <w:bookmarkStart w:id="0" w:name="__RefHeading___Toc18915_1603226370"/>
+      <w:bookmarkStart w:id="0" w:name="__RefHeading___Toc38060_2679730275"/>
       <w:bookmarkStart w:id="1" w:name="_Toc48319687"/>
       <w:bookmarkStart w:id="2" w:name="_Toc11824118"/>
       <w:bookmarkEnd w:id="0"/>
@@ -2294,7 +2294,7 @@
           <w:spacing w:val="0"/>
         </w:rPr>
       </w:pPr>
-      <w:bookmarkStart w:id="4" w:name="__RefHeading___Toc18917_1603226370"/>
+      <w:bookmarkStart w:id="4" w:name="__RefHeading___Toc38062_2679730275"/>
       <w:bookmarkStart w:id="5" w:name="_Toc233203388"/>
       <w:bookmarkEnd w:id="4"/>
       <w:r>
@@ -3836,7 +3836,7 @@
         <w:pageBreakBefore w:val="false"/>
         <w:rPr/>
       </w:pPr>
-      <w:bookmarkStart w:id="6" w:name="__RefHeading___Toc18919_1603226370"/>
+      <w:bookmarkStart w:id="6" w:name="__RefHeading___Toc38064_2679730275"/>
       <w:bookmarkEnd w:id="6"/>
       <w:r>
         <w:rPr>
@@ -3956,7 +3956,7 @@
         <w:pStyle w:val="Heading1"/>
         <w:rPr/>
       </w:pPr>
-      <w:bookmarkStart w:id="7" w:name="__RefHeading___Toc18921_1603226370"/>
+      <w:bookmarkStart w:id="7" w:name="__RefHeading___Toc38066_2679730275"/>
       <w:bookmarkEnd w:id="7"/>
       <w:r>
         <w:rPr>
@@ -3973,7 +3973,7 @@
         <w:pStyle w:val="Heading2"/>
         <w:rPr/>
       </w:pPr>
-      <w:bookmarkStart w:id="8" w:name="__RefHeading___Toc18923_1603226370"/>
+      <w:bookmarkStart w:id="8" w:name="__RefHeading___Toc38068_2679730275"/>
       <w:bookmarkEnd w:id="8"/>
       <w:r>
         <w:rPr>
@@ -3997,7 +3997,7 @@
           <w:color w:val="101820"/>
           <w:sz w:val="21"/>
         </w:rPr>
-        <w:t>This Support Agreement is made on [date] under the MSA dated [date] and Order Form no. [number]. Capitalised terms have the meaning given in the MSA. The service levels are based on the iorta TechNXT Production Support Approach and Standards.</w:t>
+        <w:t>This Support Agreement is made on [date] under the MSA dated [date] and Order Form no. [number]. Capitalised terms have the meaning given in the MSA. The service levels are based on the iorta TechNXT Production Support Approach and Standards. Support under this Support Agreement takes over from the implementation team on the date stated in the signed Hypercare Exit and Handover to Support Certificate. The Customer Responsibilities and RACI Annex sets out who does what in support.</w:t>
       </w:r>
     </w:p>
     <w:p>
@@ -4005,7 +4005,7 @@
         <w:pStyle w:val="Heading2"/>
         <w:rPr/>
       </w:pPr>
-      <w:bookmarkStart w:id="9" w:name="__RefHeading___Toc18925_1603226370"/>
+      <w:bookmarkStart w:id="9" w:name="__RefHeading___Toc38070_2679730275"/>
       <w:bookmarkEnd w:id="9"/>
       <w:r>
         <w:rPr>
@@ -4132,7 +4132,7 @@
         <w:pStyle w:val="Heading2"/>
         <w:rPr/>
       </w:pPr>
-      <w:bookmarkStart w:id="10" w:name="__RefHeading___Toc18927_1603226370"/>
+      <w:bookmarkStart w:id="10" w:name="__RefHeading___Toc38072_2679730275"/>
       <w:bookmarkEnd w:id="10"/>
       <w:r>
         <w:rPr>
@@ -4225,7 +4225,7 @@
         <w:pStyle w:val="Heading2"/>
         <w:rPr/>
       </w:pPr>
-      <w:bookmarkStart w:id="11" w:name="__RefHeading___Toc18929_1603226370"/>
+      <w:bookmarkStart w:id="11" w:name="__RefHeading___Toc38074_2679730275"/>
       <w:bookmarkEnd w:id="11"/>
       <w:r>
         <w:rPr>
@@ -4240,7 +4240,7 @@
     <w:tbl>
       <w:tblPr>
         <w:tblStyle w:val="TableGrid"/>
-        <w:tblW w:w="9027" w:type="dxa"/>
+        <w:tblW w:w="9014" w:type="dxa"/>
         <w:jc w:val="left"/>
         <w:tblInd w:w="0" w:type="dxa"/>
         <w:tblLayout w:type="fixed"/>
@@ -4253,9 +4253,9 @@
         <w:tblLook w:val="04a0" w:noHBand="0" w:noVBand="1" w:firstColumn="1" w:lastRow="0" w:lastColumn="0" w:firstRow="1"/>
       </w:tblPr>
       <w:tblGrid>
-        <w:gridCol w:w="3009"/>
-        <w:gridCol w:w="3009"/>
-        <w:gridCol w:w="3009"/>
+        <w:gridCol w:w="906"/>
+        <w:gridCol w:w="3823"/>
+        <w:gridCol w:w="4285"/>
       </w:tblGrid>
       <w:tr>
         <w:trPr>
@@ -4263,7 +4263,7 @@
         </w:trPr>
         <w:tc>
           <w:tcPr>
-            <w:tcW w:w="3009" w:type="dxa"/>
+            <w:tcW w:w="906" w:type="dxa"/>
             <w:tcBorders>
               <w:top w:val="single" w:sz="4" w:space="0" w:color="BFC7D1"/>
               <w:left w:val="single" w:sz="4" w:space="0" w:color="BFC7D1"/>
@@ -4302,7 +4302,7 @@
         </w:tc>
         <w:tc>
           <w:tcPr>
-            <w:tcW w:w="3009" w:type="dxa"/>
+            <w:tcW w:w="3823" w:type="dxa"/>
             <w:tcBorders>
               <w:top w:val="single" w:sz="4" w:space="0" w:color="BFC7D1"/>
               <w:left w:val="single" w:sz="4" w:space="0" w:color="BFC7D1"/>
@@ -4341,7 +4341,7 @@
         </w:tc>
         <w:tc>
           <w:tcPr>
-            <w:tcW w:w="3009" w:type="dxa"/>
+            <w:tcW w:w="4285" w:type="dxa"/>
             <w:tcBorders>
               <w:top w:val="single" w:sz="4" w:space="0" w:color="BFC7D1"/>
               <w:left w:val="single" w:sz="4" w:space="0" w:color="BFC7D1"/>
@@ -4383,7 +4383,7 @@
         <w:trPr/>
         <w:tc>
           <w:tcPr>
-            <w:tcW w:w="3009" w:type="dxa"/>
+            <w:tcW w:w="906" w:type="dxa"/>
             <w:tcBorders>
               <w:top w:val="single" w:sz="4" w:space="0" w:color="BFC7D1"/>
               <w:left w:val="single" w:sz="4" w:space="0" w:color="BFC7D1"/>
@@ -4420,7 +4420,7 @@
         </w:tc>
         <w:tc>
           <w:tcPr>
-            <w:tcW w:w="3009" w:type="dxa"/>
+            <w:tcW w:w="3823" w:type="dxa"/>
             <w:tcBorders>
               <w:top w:val="single" w:sz="4" w:space="0" w:color="BFC7D1"/>
               <w:left w:val="single" w:sz="4" w:space="0" w:color="BFC7D1"/>
@@ -4457,7 +4457,7 @@
         </w:tc>
         <w:tc>
           <w:tcPr>
-            <w:tcW w:w="3009" w:type="dxa"/>
+            <w:tcW w:w="4285" w:type="dxa"/>
             <w:tcBorders>
               <w:top w:val="single" w:sz="4" w:space="0" w:color="BFC7D1"/>
               <w:left w:val="single" w:sz="4" w:space="0" w:color="BFC7D1"/>
@@ -4497,7 +4497,7 @@
         <w:trPr/>
         <w:tc>
           <w:tcPr>
-            <w:tcW w:w="3009" w:type="dxa"/>
+            <w:tcW w:w="906" w:type="dxa"/>
             <w:tcBorders>
               <w:top w:val="single" w:sz="4" w:space="0" w:color="BFC7D1"/>
               <w:left w:val="single" w:sz="4" w:space="0" w:color="BFC7D1"/>
@@ -4534,7 +4534,7 @@
         </w:tc>
         <w:tc>
           <w:tcPr>
-            <w:tcW w:w="3009" w:type="dxa"/>
+            <w:tcW w:w="3823" w:type="dxa"/>
             <w:tcBorders>
               <w:top w:val="single" w:sz="4" w:space="0" w:color="BFC7D1"/>
               <w:left w:val="single" w:sz="4" w:space="0" w:color="BFC7D1"/>
@@ -4571,7 +4571,7 @@
         </w:tc>
         <w:tc>
           <w:tcPr>
-            <w:tcW w:w="3009" w:type="dxa"/>
+            <w:tcW w:w="4285" w:type="dxa"/>
             <w:tcBorders>
               <w:top w:val="single" w:sz="4" w:space="0" w:color="BFC7D1"/>
               <w:left w:val="single" w:sz="4" w:space="0" w:color="BFC7D1"/>
@@ -4611,7 +4611,7 @@
         <w:trPr/>
         <w:tc>
           <w:tcPr>
-            <w:tcW w:w="3009" w:type="dxa"/>
+            <w:tcW w:w="906" w:type="dxa"/>
             <w:tcBorders>
               <w:top w:val="single" w:sz="4" w:space="0" w:color="BFC7D1"/>
               <w:left w:val="single" w:sz="4" w:space="0" w:color="BFC7D1"/>
@@ -4648,7 +4648,7 @@
         </w:tc>
         <w:tc>
           <w:tcPr>
-            <w:tcW w:w="3009" w:type="dxa"/>
+            <w:tcW w:w="3823" w:type="dxa"/>
             <w:tcBorders>
               <w:top w:val="single" w:sz="4" w:space="0" w:color="BFC7D1"/>
               <w:left w:val="single" w:sz="4" w:space="0" w:color="BFC7D1"/>
@@ -4685,7 +4685,7 @@
         </w:tc>
         <w:tc>
           <w:tcPr>
-            <w:tcW w:w="3009" w:type="dxa"/>
+            <w:tcW w:w="4285" w:type="dxa"/>
             <w:tcBorders>
               <w:top w:val="single" w:sz="4" w:space="0" w:color="BFC7D1"/>
               <w:left w:val="single" w:sz="4" w:space="0" w:color="BFC7D1"/>
@@ -4755,7 +4755,7 @@
         <w:pStyle w:val="Heading1"/>
         <w:rPr/>
       </w:pPr>
-      <w:bookmarkStart w:id="12" w:name="__RefHeading___Toc18931_1603226370"/>
+      <w:bookmarkStart w:id="12" w:name="__RefHeading___Toc38076_2679730275"/>
       <w:bookmarkEnd w:id="12"/>
       <w:r>
         <w:rPr>
@@ -4772,7 +4772,7 @@
         <w:pStyle w:val="Heading2"/>
         <w:rPr/>
       </w:pPr>
-      <w:bookmarkStart w:id="13" w:name="__RefHeading___Toc18933_1603226370"/>
+      <w:bookmarkStart w:id="13" w:name="__RefHeading___Toc38078_2679730275"/>
       <w:bookmarkEnd w:id="13"/>
       <w:r>
         <w:rPr>
@@ -4876,7 +4876,7 @@
           <w:color w:val="101820"/>
           <w:sz w:val="21"/>
         </w:rPr>
-        <w:t>The AMC covers all Licensed Users. Additional users add AMC from their licence date, prorated to the next AMC anniversary.</w:t>
+        <w:t>The AMC covers all Licensed Users. Additional users add AMC from the later of their licence date and the AMC start, prorated to the next AMC anniversary.</w:t>
       </w:r>
     </w:p>
     <w:p>
@@ -4884,7 +4884,7 @@
         <w:pStyle w:val="Heading2"/>
         <w:rPr/>
       </w:pPr>
-      <w:bookmarkStart w:id="14" w:name="__RefHeading___Toc18935_1603226370"/>
+      <w:bookmarkStart w:id="14" w:name="__RefHeading___Toc38080_2679730275"/>
       <w:bookmarkEnd w:id="14"/>
       <w:r>
         <w:rPr>
@@ -4916,7 +4916,7 @@
         <w:pStyle w:val="Heading2"/>
         <w:rPr/>
       </w:pPr>
-      <w:bookmarkStart w:id="15" w:name="__RefHeading___Toc18937_1603226370"/>
+      <w:bookmarkStart w:id="15" w:name="__RefHeading___Toc38082_2679730275"/>
       <w:bookmarkEnd w:id="15"/>
       <w:r>
         <w:rPr>
@@ -4940,7 +4940,7 @@
           <w:color w:val="101820"/>
           <w:sz w:val="21"/>
         </w:rPr>
-        <w:t>24x7 support for P1 incidents is an option stated in the Order Form, priced yearly by size (Year 1 list prices: Small PHP 240,000.00; Medium PHP 480,000.00; Large PHP 900,000.00; Enterprise PHP 1,500,000.00), invoiced yearly in advance and increasing 5% a year.</w:t>
+        <w:t>24x7 support for P1 incidents (called 24x7 Severity 1 support in the Order Form and the price book) is an option stated in the Order Form, priced yearly by size (Year 1 list prices: Small PHP 240,000.00; Medium PHP 480,000.00; Large PHP 900,000.00; Enterprise PHP 1,500,000.00), invoiced yearly in advance and increasing 5% a year.</w:t>
       </w:r>
     </w:p>
     <w:p>
@@ -4948,7 +4948,7 @@
         <w:pStyle w:val="Heading2"/>
         <w:rPr/>
       </w:pPr>
-      <w:bookmarkStart w:id="16" w:name="__RefHeading___Toc18939_1603226370"/>
+      <w:bookmarkStart w:id="16" w:name="__RefHeading___Toc38084_2679730275"/>
       <w:bookmarkEnd w:id="16"/>
       <w:r>
         <w:rPr>
@@ -4983,7 +4983,7 @@
         <w:pStyle w:val="Heading1"/>
         <w:rPr/>
       </w:pPr>
-      <w:bookmarkStart w:id="17" w:name="__RefHeading___Toc18941_1603226370"/>
+      <w:bookmarkStart w:id="17" w:name="__RefHeading___Toc38086_2679730275"/>
       <w:bookmarkEnd w:id="17"/>
       <w:r>
         <w:rPr>
@@ -4998,7 +4998,7 @@
     <w:tbl>
       <w:tblPr>
         <w:tblStyle w:val="TableGrid"/>
-        <w:tblW w:w="9027" w:type="dxa"/>
+        <w:tblW w:w="9014" w:type="dxa"/>
         <w:jc w:val="left"/>
         <w:tblInd w:w="0" w:type="dxa"/>
         <w:tblLayout w:type="fixed"/>
@@ -5011,9 +5011,9 @@
         <w:tblLook w:val="04a0" w:noHBand="0" w:noVBand="1" w:firstColumn="1" w:lastRow="0" w:lastColumn="0" w:firstRow="1"/>
       </w:tblPr>
       <w:tblGrid>
-        <w:gridCol w:w="3009"/>
-        <w:gridCol w:w="3009"/>
-        <w:gridCol w:w="3009"/>
+        <w:gridCol w:w="2504"/>
+        <w:gridCol w:w="4005"/>
+        <w:gridCol w:w="2505"/>
       </w:tblGrid>
       <w:tr>
         <w:trPr>
@@ -5021,7 +5021,7 @@
         </w:trPr>
         <w:tc>
           <w:tcPr>
-            <w:tcW w:w="3009" w:type="dxa"/>
+            <w:tcW w:w="2504" w:type="dxa"/>
             <w:tcBorders>
               <w:top w:val="single" w:sz="4" w:space="0" w:color="BFC7D1"/>
               <w:left w:val="single" w:sz="4" w:space="0" w:color="BFC7D1"/>
@@ -5060,7 +5060,7 @@
         </w:tc>
         <w:tc>
           <w:tcPr>
-            <w:tcW w:w="3009" w:type="dxa"/>
+            <w:tcW w:w="4005" w:type="dxa"/>
             <w:tcBorders>
               <w:top w:val="single" w:sz="4" w:space="0" w:color="BFC7D1"/>
               <w:left w:val="single" w:sz="4" w:space="0" w:color="BFC7D1"/>
@@ -5099,7 +5099,7 @@
         </w:tc>
         <w:tc>
           <w:tcPr>
-            <w:tcW w:w="3009" w:type="dxa"/>
+            <w:tcW w:w="2505" w:type="dxa"/>
             <w:tcBorders>
               <w:top w:val="single" w:sz="4" w:space="0" w:color="BFC7D1"/>
               <w:left w:val="single" w:sz="4" w:space="0" w:color="BFC7D1"/>
@@ -5141,7 +5141,7 @@
         <w:trPr/>
         <w:tc>
           <w:tcPr>
-            <w:tcW w:w="3009" w:type="dxa"/>
+            <w:tcW w:w="2504" w:type="dxa"/>
             <w:tcBorders>
               <w:top w:val="single" w:sz="4" w:space="0" w:color="BFC7D1"/>
               <w:left w:val="single" w:sz="4" w:space="0" w:color="BFC7D1"/>
@@ -5178,7 +5178,7 @@
         </w:tc>
         <w:tc>
           <w:tcPr>
-            <w:tcW w:w="3009" w:type="dxa"/>
+            <w:tcW w:w="4005" w:type="dxa"/>
             <w:tcBorders>
               <w:top w:val="single" w:sz="4" w:space="0" w:color="BFC7D1"/>
               <w:left w:val="single" w:sz="4" w:space="0" w:color="BFC7D1"/>
@@ -5215,7 +5215,7 @@
         </w:tc>
         <w:tc>
           <w:tcPr>
-            <w:tcW w:w="3009" w:type="dxa"/>
+            <w:tcW w:w="2505" w:type="dxa"/>
             <w:tcBorders>
               <w:top w:val="single" w:sz="4" w:space="0" w:color="BFC7D1"/>
               <w:left w:val="single" w:sz="4" w:space="0" w:color="BFC7D1"/>
@@ -5255,7 +5255,7 @@
         <w:trPr/>
         <w:tc>
           <w:tcPr>
-            <w:tcW w:w="3009" w:type="dxa"/>
+            <w:tcW w:w="2504" w:type="dxa"/>
             <w:tcBorders>
               <w:top w:val="single" w:sz="4" w:space="0" w:color="BFC7D1"/>
               <w:left w:val="single" w:sz="4" w:space="0" w:color="BFC7D1"/>
@@ -5292,7 +5292,7 @@
         </w:tc>
         <w:tc>
           <w:tcPr>
-            <w:tcW w:w="3009" w:type="dxa"/>
+            <w:tcW w:w="4005" w:type="dxa"/>
             <w:tcBorders>
               <w:top w:val="single" w:sz="4" w:space="0" w:color="BFC7D1"/>
               <w:left w:val="single" w:sz="4" w:space="0" w:color="BFC7D1"/>
@@ -5329,7 +5329,7 @@
         </w:tc>
         <w:tc>
           <w:tcPr>
-            <w:tcW w:w="3009" w:type="dxa"/>
+            <w:tcW w:w="2505" w:type="dxa"/>
             <w:tcBorders>
               <w:top w:val="single" w:sz="4" w:space="0" w:color="BFC7D1"/>
               <w:left w:val="single" w:sz="4" w:space="0" w:color="BFC7D1"/>
@@ -5369,7 +5369,7 @@
         <w:trPr/>
         <w:tc>
           <w:tcPr>
-            <w:tcW w:w="3009" w:type="dxa"/>
+            <w:tcW w:w="2504" w:type="dxa"/>
             <w:tcBorders>
               <w:top w:val="single" w:sz="4" w:space="0" w:color="BFC7D1"/>
               <w:left w:val="single" w:sz="4" w:space="0" w:color="BFC7D1"/>
@@ -5406,7 +5406,7 @@
         </w:tc>
         <w:tc>
           <w:tcPr>
-            <w:tcW w:w="3009" w:type="dxa"/>
+            <w:tcW w:w="4005" w:type="dxa"/>
             <w:tcBorders>
               <w:top w:val="single" w:sz="4" w:space="0" w:color="BFC7D1"/>
               <w:left w:val="single" w:sz="4" w:space="0" w:color="BFC7D1"/>
@@ -5443,7 +5443,7 @@
         </w:tc>
         <w:tc>
           <w:tcPr>
-            <w:tcW w:w="3009" w:type="dxa"/>
+            <w:tcW w:w="2505" w:type="dxa"/>
             <w:tcBorders>
               <w:top w:val="single" w:sz="4" w:space="0" w:color="BFC7D1"/>
               <w:left w:val="single" w:sz="4" w:space="0" w:color="BFC7D1"/>
@@ -5513,7 +5513,7 @@
         <w:pStyle w:val="Heading1"/>
         <w:rPr/>
       </w:pPr>
-      <w:bookmarkStart w:id="18" w:name="__RefHeading___Toc18943_1603226370"/>
+      <w:bookmarkStart w:id="18" w:name="__RefHeading___Toc38088_2679730275"/>
       <w:bookmarkEnd w:id="18"/>
       <w:r>
         <w:rPr>
@@ -5530,7 +5530,7 @@
         <w:pStyle w:val="Heading2"/>
         <w:rPr/>
       </w:pPr>
-      <w:bookmarkStart w:id="19" w:name="__RefHeading___Toc18945_1603226370"/>
+      <w:bookmarkStart w:id="19" w:name="__RefHeading___Toc38090_2679730275"/>
       <w:bookmarkEnd w:id="19"/>
       <w:r>
         <w:rPr>
@@ -5545,7 +5545,7 @@
     <w:tbl>
       <w:tblPr>
         <w:tblStyle w:val="TableGrid"/>
-        <w:tblW w:w="9027" w:type="dxa"/>
+        <w:tblW w:w="9015" w:type="dxa"/>
         <w:jc w:val="left"/>
         <w:tblInd w:w="0" w:type="dxa"/>
         <w:tblLayout w:type="fixed"/>
@@ -5558,9 +5558,9 @@
         <w:tblLook w:val="04a0" w:noHBand="0" w:noVBand="1" w:firstColumn="1" w:lastRow="0" w:lastColumn="0" w:firstRow="1"/>
       </w:tblPr>
       <w:tblGrid>
-        <w:gridCol w:w="3009"/>
-        <w:gridCol w:w="3009"/>
-        <w:gridCol w:w="3009"/>
+        <w:gridCol w:w="1123"/>
+        <w:gridCol w:w="3847"/>
+        <w:gridCol w:w="4045"/>
       </w:tblGrid>
       <w:tr>
         <w:trPr>
@@ -5568,7 +5568,7 @@
         </w:trPr>
         <w:tc>
           <w:tcPr>
-            <w:tcW w:w="3009" w:type="dxa"/>
+            <w:tcW w:w="1123" w:type="dxa"/>
             <w:tcBorders>
               <w:top w:val="single" w:sz="4" w:space="0" w:color="BFC7D1"/>
               <w:left w:val="single" w:sz="4" w:space="0" w:color="BFC7D1"/>
@@ -5607,7 +5607,7 @@
         </w:tc>
         <w:tc>
           <w:tcPr>
-            <w:tcW w:w="3009" w:type="dxa"/>
+            <w:tcW w:w="3847" w:type="dxa"/>
             <w:tcBorders>
               <w:top w:val="single" w:sz="4" w:space="0" w:color="BFC7D1"/>
               <w:left w:val="single" w:sz="4" w:space="0" w:color="BFC7D1"/>
@@ -5646,7 +5646,7 @@
         </w:tc>
         <w:tc>
           <w:tcPr>
-            <w:tcW w:w="3009" w:type="dxa"/>
+            <w:tcW w:w="4045" w:type="dxa"/>
             <w:tcBorders>
               <w:top w:val="single" w:sz="4" w:space="0" w:color="BFC7D1"/>
               <w:left w:val="single" w:sz="4" w:space="0" w:color="BFC7D1"/>
@@ -5688,7 +5688,7 @@
         <w:trPr/>
         <w:tc>
           <w:tcPr>
-            <w:tcW w:w="3009" w:type="dxa"/>
+            <w:tcW w:w="1123" w:type="dxa"/>
             <w:tcBorders>
               <w:top w:val="single" w:sz="4" w:space="0" w:color="BFC7D1"/>
               <w:left w:val="single" w:sz="4" w:space="0" w:color="BFC7D1"/>
@@ -5725,7 +5725,7 @@
         </w:tc>
         <w:tc>
           <w:tcPr>
-            <w:tcW w:w="3009" w:type="dxa"/>
+            <w:tcW w:w="3847" w:type="dxa"/>
             <w:tcBorders>
               <w:top w:val="single" w:sz="4" w:space="0" w:color="BFC7D1"/>
               <w:left w:val="single" w:sz="4" w:space="0" w:color="BFC7D1"/>
@@ -5762,7 +5762,7 @@
         </w:tc>
         <w:tc>
           <w:tcPr>
-            <w:tcW w:w="3009" w:type="dxa"/>
+            <w:tcW w:w="4045" w:type="dxa"/>
             <w:tcBorders>
               <w:top w:val="single" w:sz="4" w:space="0" w:color="BFC7D1"/>
               <w:left w:val="single" w:sz="4" w:space="0" w:color="BFC7D1"/>
@@ -5802,7 +5802,7 @@
         <w:trPr/>
         <w:tc>
           <w:tcPr>
-            <w:tcW w:w="3009" w:type="dxa"/>
+            <w:tcW w:w="1123" w:type="dxa"/>
             <w:tcBorders>
               <w:top w:val="single" w:sz="4" w:space="0" w:color="BFC7D1"/>
               <w:left w:val="single" w:sz="4" w:space="0" w:color="BFC7D1"/>
@@ -5839,7 +5839,7 @@
         </w:tc>
         <w:tc>
           <w:tcPr>
-            <w:tcW w:w="3009" w:type="dxa"/>
+            <w:tcW w:w="3847" w:type="dxa"/>
             <w:tcBorders>
               <w:top w:val="single" w:sz="4" w:space="0" w:color="BFC7D1"/>
               <w:left w:val="single" w:sz="4" w:space="0" w:color="BFC7D1"/>
@@ -5876,7 +5876,7 @@
         </w:tc>
         <w:tc>
           <w:tcPr>
-            <w:tcW w:w="3009" w:type="dxa"/>
+            <w:tcW w:w="4045" w:type="dxa"/>
             <w:tcBorders>
               <w:top w:val="single" w:sz="4" w:space="0" w:color="BFC7D1"/>
               <w:left w:val="single" w:sz="4" w:space="0" w:color="BFC7D1"/>
@@ -5916,7 +5916,7 @@
         <w:trPr/>
         <w:tc>
           <w:tcPr>
-            <w:tcW w:w="3009" w:type="dxa"/>
+            <w:tcW w:w="1123" w:type="dxa"/>
             <w:tcBorders>
               <w:top w:val="single" w:sz="4" w:space="0" w:color="BFC7D1"/>
               <w:left w:val="single" w:sz="4" w:space="0" w:color="BFC7D1"/>
@@ -5953,7 +5953,7 @@
         </w:tc>
         <w:tc>
           <w:tcPr>
-            <w:tcW w:w="3009" w:type="dxa"/>
+            <w:tcW w:w="3847" w:type="dxa"/>
             <w:tcBorders>
               <w:top w:val="single" w:sz="4" w:space="0" w:color="BFC7D1"/>
               <w:left w:val="single" w:sz="4" w:space="0" w:color="BFC7D1"/>
@@ -5990,7 +5990,7 @@
         </w:tc>
         <w:tc>
           <w:tcPr>
-            <w:tcW w:w="3009" w:type="dxa"/>
+            <w:tcW w:w="4045" w:type="dxa"/>
             <w:tcBorders>
               <w:top w:val="single" w:sz="4" w:space="0" w:color="BFC7D1"/>
               <w:left w:val="single" w:sz="4" w:space="0" w:color="BFC7D1"/>
@@ -6030,7 +6030,7 @@
         <w:trPr/>
         <w:tc>
           <w:tcPr>
-            <w:tcW w:w="3009" w:type="dxa"/>
+            <w:tcW w:w="1123" w:type="dxa"/>
             <w:tcBorders>
               <w:top w:val="single" w:sz="4" w:space="0" w:color="BFC7D1"/>
               <w:left w:val="single" w:sz="4" w:space="0" w:color="BFC7D1"/>
@@ -6067,7 +6067,7 @@
         </w:tc>
         <w:tc>
           <w:tcPr>
-            <w:tcW w:w="3009" w:type="dxa"/>
+            <w:tcW w:w="3847" w:type="dxa"/>
             <w:tcBorders>
               <w:top w:val="single" w:sz="4" w:space="0" w:color="BFC7D1"/>
               <w:left w:val="single" w:sz="4" w:space="0" w:color="BFC7D1"/>
@@ -6104,7 +6104,7 @@
         </w:tc>
         <w:tc>
           <w:tcPr>
-            <w:tcW w:w="3009" w:type="dxa"/>
+            <w:tcW w:w="4045" w:type="dxa"/>
             <w:tcBorders>
               <w:top w:val="single" w:sz="4" w:space="0" w:color="BFC7D1"/>
               <w:left w:val="single" w:sz="4" w:space="0" w:color="BFC7D1"/>
@@ -6171,7 +6171,7 @@
         <w:pStyle w:val="Heading2"/>
         <w:rPr/>
       </w:pPr>
-      <w:bookmarkStart w:id="20" w:name="__RefHeading___Toc18947_1603226370"/>
+      <w:bookmarkStart w:id="20" w:name="__RefHeading___Toc38092_2679730275"/>
       <w:bookmarkEnd w:id="20"/>
       <w:r>
         <w:rPr>
@@ -6186,7 +6186,7 @@
     <w:tbl>
       <w:tblPr>
         <w:tblStyle w:val="TableGrid"/>
-        <w:tblW w:w="9026" w:type="dxa"/>
+        <w:tblW w:w="9014" w:type="dxa"/>
         <w:jc w:val="left"/>
         <w:tblInd w:w="0" w:type="dxa"/>
         <w:tblLayout w:type="fixed"/>
@@ -6199,11 +6199,11 @@
         <w:tblLook w:val="04a0" w:noHBand="0" w:noVBand="1" w:firstColumn="1" w:lastRow="0" w:lastColumn="0" w:firstRow="1"/>
       </w:tblPr>
       <w:tblGrid>
-        <w:gridCol w:w="1805"/>
-        <w:gridCol w:w="1805"/>
-        <w:gridCol w:w="1805"/>
-        <w:gridCol w:w="1805"/>
-        <w:gridCol w:w="1806"/>
+        <w:gridCol w:w="1123"/>
+        <w:gridCol w:w="1123"/>
+        <w:gridCol w:w="1564"/>
+        <w:gridCol w:w="2159"/>
+        <w:gridCol w:w="3045"/>
       </w:tblGrid>
       <w:tr>
         <w:trPr>
@@ -6211,7 +6211,7 @@
         </w:trPr>
         <w:tc>
           <w:tcPr>
-            <w:tcW w:w="1805" w:type="dxa"/>
+            <w:tcW w:w="1123" w:type="dxa"/>
             <w:tcBorders>
               <w:top w:val="single" w:sz="4" w:space="0" w:color="BFC7D1"/>
               <w:left w:val="single" w:sz="4" w:space="0" w:color="BFC7D1"/>
@@ -6250,7 +6250,7 @@
         </w:tc>
         <w:tc>
           <w:tcPr>
-            <w:tcW w:w="1805" w:type="dxa"/>
+            <w:tcW w:w="1123" w:type="dxa"/>
             <w:tcBorders>
               <w:top w:val="single" w:sz="4" w:space="0" w:color="BFC7D1"/>
               <w:left w:val="single" w:sz="4" w:space="0" w:color="BFC7D1"/>
@@ -6289,7 +6289,7 @@
         </w:tc>
         <w:tc>
           <w:tcPr>
-            <w:tcW w:w="1805" w:type="dxa"/>
+            <w:tcW w:w="1564" w:type="dxa"/>
             <w:tcBorders>
               <w:top w:val="single" w:sz="4" w:space="0" w:color="BFC7D1"/>
               <w:left w:val="single" w:sz="4" w:space="0" w:color="BFC7D1"/>
@@ -6328,7 +6328,7 @@
         </w:tc>
         <w:tc>
           <w:tcPr>
-            <w:tcW w:w="1805" w:type="dxa"/>
+            <w:tcW w:w="2159" w:type="dxa"/>
             <w:tcBorders>
               <w:top w:val="single" w:sz="4" w:space="0" w:color="BFC7D1"/>
               <w:left w:val="single" w:sz="4" w:space="0" w:color="BFC7D1"/>
@@ -6367,7 +6367,7 @@
         </w:tc>
         <w:tc>
           <w:tcPr>
-            <w:tcW w:w="1806" w:type="dxa"/>
+            <w:tcW w:w="3045" w:type="dxa"/>
             <w:tcBorders>
               <w:top w:val="single" w:sz="4" w:space="0" w:color="BFC7D1"/>
               <w:left w:val="single" w:sz="4" w:space="0" w:color="BFC7D1"/>
@@ -6409,7 +6409,7 @@
         <w:trPr/>
         <w:tc>
           <w:tcPr>
-            <w:tcW w:w="1805" w:type="dxa"/>
+            <w:tcW w:w="1123" w:type="dxa"/>
             <w:tcBorders>
               <w:top w:val="single" w:sz="4" w:space="0" w:color="BFC7D1"/>
               <w:left w:val="single" w:sz="4" w:space="0" w:color="BFC7D1"/>
@@ -6446,7 +6446,7 @@
         </w:tc>
         <w:tc>
           <w:tcPr>
-            <w:tcW w:w="1805" w:type="dxa"/>
+            <w:tcW w:w="1123" w:type="dxa"/>
             <w:tcBorders>
               <w:top w:val="single" w:sz="4" w:space="0" w:color="BFC7D1"/>
               <w:left w:val="single" w:sz="4" w:space="0" w:color="BFC7D1"/>
@@ -6483,7 +6483,7 @@
         </w:tc>
         <w:tc>
           <w:tcPr>
-            <w:tcW w:w="1805" w:type="dxa"/>
+            <w:tcW w:w="1564" w:type="dxa"/>
             <w:tcBorders>
               <w:top w:val="single" w:sz="4" w:space="0" w:color="BFC7D1"/>
               <w:left w:val="single" w:sz="4" w:space="0" w:color="BFC7D1"/>
@@ -6520,7 +6520,7 @@
         </w:tc>
         <w:tc>
           <w:tcPr>
-            <w:tcW w:w="1805" w:type="dxa"/>
+            <w:tcW w:w="2159" w:type="dxa"/>
             <w:tcBorders>
               <w:top w:val="single" w:sz="4" w:space="0" w:color="BFC7D1"/>
               <w:left w:val="single" w:sz="4" w:space="0" w:color="BFC7D1"/>
@@ -6557,7 +6557,7 @@
         </w:tc>
         <w:tc>
           <w:tcPr>
-            <w:tcW w:w="1806" w:type="dxa"/>
+            <w:tcW w:w="3045" w:type="dxa"/>
             <w:tcBorders>
               <w:top w:val="single" w:sz="4" w:space="0" w:color="BFC7D1"/>
               <w:left w:val="single" w:sz="4" w:space="0" w:color="BFC7D1"/>
@@ -6597,7 +6597,7 @@
         <w:trPr/>
         <w:tc>
           <w:tcPr>
-            <w:tcW w:w="1805" w:type="dxa"/>
+            <w:tcW w:w="1123" w:type="dxa"/>
             <w:tcBorders>
               <w:top w:val="single" w:sz="4" w:space="0" w:color="BFC7D1"/>
               <w:left w:val="single" w:sz="4" w:space="0" w:color="BFC7D1"/>
@@ -6634,7 +6634,7 @@
         </w:tc>
         <w:tc>
           <w:tcPr>
-            <w:tcW w:w="1805" w:type="dxa"/>
+            <w:tcW w:w="1123" w:type="dxa"/>
             <w:tcBorders>
               <w:top w:val="single" w:sz="4" w:space="0" w:color="BFC7D1"/>
               <w:left w:val="single" w:sz="4" w:space="0" w:color="BFC7D1"/>
@@ -6671,7 +6671,7 @@
         </w:tc>
         <w:tc>
           <w:tcPr>
-            <w:tcW w:w="1805" w:type="dxa"/>
+            <w:tcW w:w="1564" w:type="dxa"/>
             <w:tcBorders>
               <w:top w:val="single" w:sz="4" w:space="0" w:color="BFC7D1"/>
               <w:left w:val="single" w:sz="4" w:space="0" w:color="BFC7D1"/>
@@ -6708,7 +6708,7 @@
         </w:tc>
         <w:tc>
           <w:tcPr>
-            <w:tcW w:w="1805" w:type="dxa"/>
+            <w:tcW w:w="2159" w:type="dxa"/>
             <w:tcBorders>
               <w:top w:val="single" w:sz="4" w:space="0" w:color="BFC7D1"/>
               <w:left w:val="single" w:sz="4" w:space="0" w:color="BFC7D1"/>
@@ -6745,7 +6745,7 @@
         </w:tc>
         <w:tc>
           <w:tcPr>
-            <w:tcW w:w="1806" w:type="dxa"/>
+            <w:tcW w:w="3045" w:type="dxa"/>
             <w:tcBorders>
               <w:top w:val="single" w:sz="4" w:space="0" w:color="BFC7D1"/>
               <w:left w:val="single" w:sz="4" w:space="0" w:color="BFC7D1"/>
@@ -6785,7 +6785,7 @@
         <w:trPr/>
         <w:tc>
           <w:tcPr>
-            <w:tcW w:w="1805" w:type="dxa"/>
+            <w:tcW w:w="1123" w:type="dxa"/>
             <w:tcBorders>
               <w:top w:val="single" w:sz="4" w:space="0" w:color="BFC7D1"/>
               <w:left w:val="single" w:sz="4" w:space="0" w:color="BFC7D1"/>
@@ -6822,7 +6822,7 @@
         </w:tc>
         <w:tc>
           <w:tcPr>
-            <w:tcW w:w="1805" w:type="dxa"/>
+            <w:tcW w:w="1123" w:type="dxa"/>
             <w:tcBorders>
               <w:top w:val="single" w:sz="4" w:space="0" w:color="BFC7D1"/>
               <w:left w:val="single" w:sz="4" w:space="0" w:color="BFC7D1"/>
@@ -6859,7 +6859,7 @@
         </w:tc>
         <w:tc>
           <w:tcPr>
-            <w:tcW w:w="1805" w:type="dxa"/>
+            <w:tcW w:w="1564" w:type="dxa"/>
             <w:tcBorders>
               <w:top w:val="single" w:sz="4" w:space="0" w:color="BFC7D1"/>
               <w:left w:val="single" w:sz="4" w:space="0" w:color="BFC7D1"/>
@@ -6896,7 +6896,7 @@
         </w:tc>
         <w:tc>
           <w:tcPr>
-            <w:tcW w:w="1805" w:type="dxa"/>
+            <w:tcW w:w="2159" w:type="dxa"/>
             <w:tcBorders>
               <w:top w:val="single" w:sz="4" w:space="0" w:color="BFC7D1"/>
               <w:left w:val="single" w:sz="4" w:space="0" w:color="BFC7D1"/>
@@ -6933,7 +6933,7 @@
         </w:tc>
         <w:tc>
           <w:tcPr>
-            <w:tcW w:w="1806" w:type="dxa"/>
+            <w:tcW w:w="3045" w:type="dxa"/>
             <w:tcBorders>
               <w:top w:val="single" w:sz="4" w:space="0" w:color="BFC7D1"/>
               <w:left w:val="single" w:sz="4" w:space="0" w:color="BFC7D1"/>
@@ -6973,7 +6973,7 @@
         <w:trPr/>
         <w:tc>
           <w:tcPr>
-            <w:tcW w:w="1805" w:type="dxa"/>
+            <w:tcW w:w="1123" w:type="dxa"/>
             <w:tcBorders>
               <w:top w:val="single" w:sz="4" w:space="0" w:color="BFC7D1"/>
               <w:left w:val="single" w:sz="4" w:space="0" w:color="BFC7D1"/>
@@ -7010,7 +7010,7 @@
         </w:tc>
         <w:tc>
           <w:tcPr>
-            <w:tcW w:w="1805" w:type="dxa"/>
+            <w:tcW w:w="1123" w:type="dxa"/>
             <w:tcBorders>
               <w:top w:val="single" w:sz="4" w:space="0" w:color="BFC7D1"/>
               <w:left w:val="single" w:sz="4" w:space="0" w:color="BFC7D1"/>
@@ -7047,7 +7047,7 @@
         </w:tc>
         <w:tc>
           <w:tcPr>
-            <w:tcW w:w="1805" w:type="dxa"/>
+            <w:tcW w:w="1564" w:type="dxa"/>
             <w:tcBorders>
               <w:top w:val="single" w:sz="4" w:space="0" w:color="BFC7D1"/>
               <w:left w:val="single" w:sz="4" w:space="0" w:color="BFC7D1"/>
@@ -7084,7 +7084,7 @@
         </w:tc>
         <w:tc>
           <w:tcPr>
-            <w:tcW w:w="1805" w:type="dxa"/>
+            <w:tcW w:w="2159" w:type="dxa"/>
             <w:tcBorders>
               <w:top w:val="single" w:sz="4" w:space="0" w:color="BFC7D1"/>
               <w:left w:val="single" w:sz="4" w:space="0" w:color="BFC7D1"/>
@@ -7121,7 +7121,7 @@
         </w:tc>
         <w:tc>
           <w:tcPr>
-            <w:tcW w:w="1806" w:type="dxa"/>
+            <w:tcW w:w="3045" w:type="dxa"/>
             <w:tcBorders>
               <w:top w:val="single" w:sz="4" w:space="0" w:color="BFC7D1"/>
               <w:left w:val="single" w:sz="4" w:space="0" w:color="BFC7D1"/>
@@ -7173,7 +7173,7 @@
         <w:pStyle w:val="Heading2"/>
         <w:rPr/>
       </w:pPr>
-      <w:bookmarkStart w:id="21" w:name="__RefHeading___Toc18949_1603226370"/>
+      <w:bookmarkStart w:id="21" w:name="__RefHeading___Toc38094_2679730275"/>
       <w:bookmarkEnd w:id="21"/>
       <w:r>
         <w:rPr>
@@ -7269,7 +7269,7 @@
         <w:pStyle w:val="Heading1"/>
         <w:rPr/>
       </w:pPr>
-      <w:bookmarkStart w:id="22" w:name="__RefHeading___Toc18951_1603226370"/>
+      <w:bookmarkStart w:id="22" w:name="__RefHeading___Toc38096_2679730275"/>
       <w:bookmarkEnd w:id="22"/>
       <w:r>
         <w:rPr>
@@ -7286,7 +7286,7 @@
         <w:pStyle w:val="Heading2"/>
         <w:rPr/>
       </w:pPr>
-      <w:bookmarkStart w:id="23" w:name="__RefHeading___Toc18953_1603226370"/>
+      <w:bookmarkStart w:id="23" w:name="__RefHeading___Toc38098_2679730275"/>
       <w:bookmarkEnd w:id="23"/>
       <w:r>
         <w:rPr>
@@ -7451,7 +7451,7 @@
         <w:pStyle w:val="Heading2"/>
         <w:rPr/>
       </w:pPr>
-      <w:bookmarkStart w:id="24" w:name="__RefHeading___Toc18955_1603226370"/>
+      <w:bookmarkStart w:id="24" w:name="__RefHeading___Toc38100_2679730275"/>
       <w:bookmarkEnd w:id="24"/>
       <w:r>
         <w:rPr>
@@ -7486,7 +7486,7 @@
         <w:pStyle w:val="Heading1"/>
         <w:rPr/>
       </w:pPr>
-      <w:bookmarkStart w:id="25" w:name="__RefHeading___Toc18957_1603226370"/>
+      <w:bookmarkStart w:id="25" w:name="__RefHeading___Toc38102_2679730275"/>
       <w:bookmarkEnd w:id="25"/>
       <w:r>
         <w:rPr>
@@ -7501,7 +7501,7 @@
     <w:tbl>
       <w:tblPr>
         <w:tblStyle w:val="TableGrid"/>
-        <w:tblW w:w="9027" w:type="dxa"/>
+        <w:tblW w:w="9015" w:type="dxa"/>
         <w:jc w:val="left"/>
         <w:tblInd w:w="0" w:type="dxa"/>
         <w:tblLayout w:type="fixed"/>
@@ -7514,9 +7514,9 @@
         <w:tblLook w:val="04a0" w:noHBand="0" w:noVBand="1" w:firstColumn="1" w:lastRow="0" w:lastColumn="0" w:firstRow="1"/>
       </w:tblPr>
       <w:tblGrid>
-        <w:gridCol w:w="3009"/>
-        <w:gridCol w:w="3009"/>
-        <w:gridCol w:w="3009"/>
+        <w:gridCol w:w="3026"/>
+        <w:gridCol w:w="2962"/>
+        <w:gridCol w:w="3027"/>
       </w:tblGrid>
       <w:tr>
         <w:trPr>
@@ -7524,7 +7524,7 @@
         </w:trPr>
         <w:tc>
           <w:tcPr>
-            <w:tcW w:w="3009" w:type="dxa"/>
+            <w:tcW w:w="3026" w:type="dxa"/>
             <w:tcBorders>
               <w:top w:val="single" w:sz="4" w:space="0" w:color="BFC7D1"/>
               <w:left w:val="single" w:sz="4" w:space="0" w:color="BFC7D1"/>
@@ -7563,7 +7563,7 @@
         </w:tc>
         <w:tc>
           <w:tcPr>
-            <w:tcW w:w="3009" w:type="dxa"/>
+            <w:tcW w:w="2962" w:type="dxa"/>
             <w:tcBorders>
               <w:top w:val="single" w:sz="4" w:space="0" w:color="BFC7D1"/>
               <w:left w:val="single" w:sz="4" w:space="0" w:color="BFC7D1"/>
@@ -7602,7 +7602,7 @@
         </w:tc>
         <w:tc>
           <w:tcPr>
-            <w:tcW w:w="3009" w:type="dxa"/>
+            <w:tcW w:w="3027" w:type="dxa"/>
             <w:tcBorders>
               <w:top w:val="single" w:sz="4" w:space="0" w:color="BFC7D1"/>
               <w:left w:val="single" w:sz="4" w:space="0" w:color="BFC7D1"/>
@@ -7644,7 +7644,7 @@
         <w:trPr/>
         <w:tc>
           <w:tcPr>
-            <w:tcW w:w="3009" w:type="dxa"/>
+            <w:tcW w:w="3026" w:type="dxa"/>
             <w:tcBorders>
               <w:top w:val="single" w:sz="4" w:space="0" w:color="BFC7D1"/>
               <w:left w:val="single" w:sz="4" w:space="0" w:color="BFC7D1"/>
@@ -7681,7 +7681,7 @@
         </w:tc>
         <w:tc>
           <w:tcPr>
-            <w:tcW w:w="3009" w:type="dxa"/>
+            <w:tcW w:w="2962" w:type="dxa"/>
             <w:tcBorders>
               <w:top w:val="single" w:sz="4" w:space="0" w:color="BFC7D1"/>
               <w:left w:val="single" w:sz="4" w:space="0" w:color="BFC7D1"/>
@@ -7718,7 +7718,7 @@
         </w:tc>
         <w:tc>
           <w:tcPr>
-            <w:tcW w:w="3009" w:type="dxa"/>
+            <w:tcW w:w="3027" w:type="dxa"/>
             <w:tcBorders>
               <w:top w:val="single" w:sz="4" w:space="0" w:color="BFC7D1"/>
               <w:left w:val="single" w:sz="4" w:space="0" w:color="BFC7D1"/>
@@ -7758,7 +7758,7 @@
         <w:trPr/>
         <w:tc>
           <w:tcPr>
-            <w:tcW w:w="3009" w:type="dxa"/>
+            <w:tcW w:w="3026" w:type="dxa"/>
             <w:tcBorders>
               <w:top w:val="single" w:sz="4" w:space="0" w:color="BFC7D1"/>
               <w:left w:val="single" w:sz="4" w:space="0" w:color="BFC7D1"/>
@@ -7795,7 +7795,7 @@
         </w:tc>
         <w:tc>
           <w:tcPr>
-            <w:tcW w:w="3009" w:type="dxa"/>
+            <w:tcW w:w="2962" w:type="dxa"/>
             <w:tcBorders>
               <w:top w:val="single" w:sz="4" w:space="0" w:color="BFC7D1"/>
               <w:left w:val="single" w:sz="4" w:space="0" w:color="BFC7D1"/>
@@ -7832,7 +7832,7 @@
         </w:tc>
         <w:tc>
           <w:tcPr>
-            <w:tcW w:w="3009" w:type="dxa"/>
+            <w:tcW w:w="3027" w:type="dxa"/>
             <w:tcBorders>
               <w:top w:val="single" w:sz="4" w:space="0" w:color="BFC7D1"/>
               <w:left w:val="single" w:sz="4" w:space="0" w:color="BFC7D1"/>
@@ -7872,7 +7872,7 @@
         <w:trPr/>
         <w:tc>
           <w:tcPr>
-            <w:tcW w:w="3009" w:type="dxa"/>
+            <w:tcW w:w="3026" w:type="dxa"/>
             <w:tcBorders>
               <w:top w:val="single" w:sz="4" w:space="0" w:color="BFC7D1"/>
               <w:left w:val="single" w:sz="4" w:space="0" w:color="BFC7D1"/>
@@ -7909,7 +7909,7 @@
         </w:tc>
         <w:tc>
           <w:tcPr>
-            <w:tcW w:w="3009" w:type="dxa"/>
+            <w:tcW w:w="2962" w:type="dxa"/>
             <w:tcBorders>
               <w:top w:val="single" w:sz="4" w:space="0" w:color="BFC7D1"/>
               <w:left w:val="single" w:sz="4" w:space="0" w:color="BFC7D1"/>
@@ -7946,7 +7946,7 @@
         </w:tc>
         <w:tc>
           <w:tcPr>
-            <w:tcW w:w="3009" w:type="dxa"/>
+            <w:tcW w:w="3027" w:type="dxa"/>
             <w:tcBorders>
               <w:top w:val="single" w:sz="4" w:space="0" w:color="BFC7D1"/>
               <w:left w:val="single" w:sz="4" w:space="0" w:color="BFC7D1"/>
@@ -7986,7 +7986,7 @@
         <w:trPr/>
         <w:tc>
           <w:tcPr>
-            <w:tcW w:w="3009" w:type="dxa"/>
+            <w:tcW w:w="3026" w:type="dxa"/>
             <w:tcBorders>
               <w:top w:val="single" w:sz="4" w:space="0" w:color="BFC7D1"/>
               <w:left w:val="single" w:sz="4" w:space="0" w:color="BFC7D1"/>
@@ -8023,7 +8023,7 @@
         </w:tc>
         <w:tc>
           <w:tcPr>
-            <w:tcW w:w="3009" w:type="dxa"/>
+            <w:tcW w:w="2962" w:type="dxa"/>
             <w:tcBorders>
               <w:top w:val="single" w:sz="4" w:space="0" w:color="BFC7D1"/>
               <w:left w:val="single" w:sz="4" w:space="0" w:color="BFC7D1"/>
@@ -8060,7 +8060,7 @@
         </w:tc>
         <w:tc>
           <w:tcPr>
-            <w:tcW w:w="3009" w:type="dxa"/>
+            <w:tcW w:w="3027" w:type="dxa"/>
             <w:tcBorders>
               <w:top w:val="single" w:sz="4" w:space="0" w:color="BFC7D1"/>
               <w:left w:val="single" w:sz="4" w:space="0" w:color="BFC7D1"/>
@@ -8100,7 +8100,7 @@
         <w:trPr/>
         <w:tc>
           <w:tcPr>
-            <w:tcW w:w="3009" w:type="dxa"/>
+            <w:tcW w:w="3026" w:type="dxa"/>
             <w:tcBorders>
               <w:top w:val="single" w:sz="4" w:space="0" w:color="BFC7D1"/>
               <w:left w:val="single" w:sz="4" w:space="0" w:color="BFC7D1"/>
@@ -8137,7 +8137,7 @@
         </w:tc>
         <w:tc>
           <w:tcPr>
-            <w:tcW w:w="3009" w:type="dxa"/>
+            <w:tcW w:w="2962" w:type="dxa"/>
             <w:tcBorders>
               <w:top w:val="single" w:sz="4" w:space="0" w:color="BFC7D1"/>
               <w:left w:val="single" w:sz="4" w:space="0" w:color="BFC7D1"/>
@@ -8174,7 +8174,7 @@
         </w:tc>
         <w:tc>
           <w:tcPr>
-            <w:tcW w:w="3009" w:type="dxa"/>
+            <w:tcW w:w="3027" w:type="dxa"/>
             <w:tcBorders>
               <w:top w:val="single" w:sz="4" w:space="0" w:color="BFC7D1"/>
               <w:left w:val="single" w:sz="4" w:space="0" w:color="BFC7D1"/>
@@ -8214,7 +8214,7 @@
         <w:trPr/>
         <w:tc>
           <w:tcPr>
-            <w:tcW w:w="3009" w:type="dxa"/>
+            <w:tcW w:w="3026" w:type="dxa"/>
             <w:tcBorders>
               <w:top w:val="single" w:sz="4" w:space="0" w:color="BFC7D1"/>
               <w:left w:val="single" w:sz="4" w:space="0" w:color="BFC7D1"/>
@@ -8251,7 +8251,7 @@
         </w:tc>
         <w:tc>
           <w:tcPr>
-            <w:tcW w:w="3009" w:type="dxa"/>
+            <w:tcW w:w="2962" w:type="dxa"/>
             <w:tcBorders>
               <w:top w:val="single" w:sz="4" w:space="0" w:color="BFC7D1"/>
               <w:left w:val="single" w:sz="4" w:space="0" w:color="BFC7D1"/>
@@ -8288,7 +8288,7 @@
         </w:tc>
         <w:tc>
           <w:tcPr>
-            <w:tcW w:w="3009" w:type="dxa"/>
+            <w:tcW w:w="3027" w:type="dxa"/>
             <w:tcBorders>
               <w:top w:val="single" w:sz="4" w:space="0" w:color="BFC7D1"/>
               <w:left w:val="single" w:sz="4" w:space="0" w:color="BFC7D1"/>
@@ -8328,7 +8328,7 @@
         <w:trPr/>
         <w:tc>
           <w:tcPr>
-            <w:tcW w:w="3009" w:type="dxa"/>
+            <w:tcW w:w="3026" w:type="dxa"/>
             <w:tcBorders>
               <w:top w:val="single" w:sz="4" w:space="0" w:color="BFC7D1"/>
               <w:left w:val="single" w:sz="4" w:space="0" w:color="BFC7D1"/>
@@ -8365,7 +8365,7 @@
         </w:tc>
         <w:tc>
           <w:tcPr>
-            <w:tcW w:w="3009" w:type="dxa"/>
+            <w:tcW w:w="2962" w:type="dxa"/>
             <w:tcBorders>
               <w:top w:val="single" w:sz="4" w:space="0" w:color="BFC7D1"/>
               <w:left w:val="single" w:sz="4" w:space="0" w:color="BFC7D1"/>
@@ -8402,7 +8402,7 @@
         </w:tc>
         <w:tc>
           <w:tcPr>
-            <w:tcW w:w="3009" w:type="dxa"/>
+            <w:tcW w:w="3027" w:type="dxa"/>
             <w:tcBorders>
               <w:top w:val="single" w:sz="4" w:space="0" w:color="BFC7D1"/>
               <w:left w:val="single" w:sz="4" w:space="0" w:color="BFC7D1"/>
@@ -8472,7 +8472,7 @@
         <w:pStyle w:val="Heading1"/>
         <w:rPr/>
       </w:pPr>
-      <w:bookmarkStart w:id="26" w:name="__RefHeading___Toc18959_1603226370"/>
+      <w:bookmarkStart w:id="26" w:name="__RefHeading___Toc38104_2679730275"/>
       <w:bookmarkEnd w:id="26"/>
       <w:r>
         <w:rPr>
@@ -8489,7 +8489,7 @@
         <w:pStyle w:val="Heading2"/>
         <w:rPr/>
       </w:pPr>
-      <w:bookmarkStart w:id="27" w:name="__RefHeading___Toc18961_1603226370"/>
+      <w:bookmarkStart w:id="27" w:name="__RefHeading___Toc38106_2679730275"/>
       <w:bookmarkEnd w:id="27"/>
       <w:r>
         <w:rPr>
@@ -8519,7 +8519,7 @@
     <w:tbl>
       <w:tblPr>
         <w:tblStyle w:val="TableGrid"/>
-        <w:tblW w:w="9026" w:type="dxa"/>
+        <w:tblW w:w="9014" w:type="dxa"/>
         <w:jc w:val="left"/>
         <w:tblInd w:w="0" w:type="dxa"/>
         <w:tblLayout w:type="fixed"/>
@@ -8532,8 +8532,8 @@
         <w:tblLook w:val="04a0" w:noHBand="0" w:noVBand="1" w:firstColumn="1" w:lastRow="0" w:lastColumn="0" w:firstRow="1"/>
       </w:tblPr>
       <w:tblGrid>
-        <w:gridCol w:w="4513"/>
-        <w:gridCol w:w="4512"/>
+        <w:gridCol w:w="6978"/>
+        <w:gridCol w:w="2035"/>
       </w:tblGrid>
       <w:tr>
         <w:trPr>
@@ -8541,7 +8541,7 @@
         </w:trPr>
         <w:tc>
           <w:tcPr>
-            <w:tcW w:w="4513" w:type="dxa"/>
+            <w:tcW w:w="6978" w:type="dxa"/>
             <w:tcBorders>
               <w:top w:val="single" w:sz="4" w:space="0" w:color="BFC7D1"/>
               <w:left w:val="single" w:sz="4" w:space="0" w:color="BFC7D1"/>
@@ -8580,7 +8580,7 @@
         </w:tc>
         <w:tc>
           <w:tcPr>
-            <w:tcW w:w="4512" w:type="dxa"/>
+            <w:tcW w:w="2035" w:type="dxa"/>
             <w:tcBorders>
               <w:top w:val="single" w:sz="4" w:space="0" w:color="BFC7D1"/>
               <w:left w:val="single" w:sz="4" w:space="0" w:color="BFC7D1"/>
@@ -8622,7 +8622,7 @@
         <w:trPr/>
         <w:tc>
           <w:tcPr>
-            <w:tcW w:w="4513" w:type="dxa"/>
+            <w:tcW w:w="6978" w:type="dxa"/>
             <w:tcBorders>
               <w:top w:val="single" w:sz="4" w:space="0" w:color="BFC7D1"/>
               <w:left w:val="single" w:sz="4" w:space="0" w:color="BFC7D1"/>
@@ -8659,7 +8659,7 @@
         </w:tc>
         <w:tc>
           <w:tcPr>
-            <w:tcW w:w="4512" w:type="dxa"/>
+            <w:tcW w:w="2035" w:type="dxa"/>
             <w:tcBorders>
               <w:top w:val="single" w:sz="4" w:space="0" w:color="BFC7D1"/>
               <w:left w:val="single" w:sz="4" w:space="0" w:color="BFC7D1"/>
@@ -8699,7 +8699,7 @@
         <w:trPr/>
         <w:tc>
           <w:tcPr>
-            <w:tcW w:w="4513" w:type="dxa"/>
+            <w:tcW w:w="6978" w:type="dxa"/>
             <w:tcBorders>
               <w:top w:val="single" w:sz="4" w:space="0" w:color="BFC7D1"/>
               <w:left w:val="single" w:sz="4" w:space="0" w:color="BFC7D1"/>
@@ -8736,7 +8736,7 @@
         </w:tc>
         <w:tc>
           <w:tcPr>
-            <w:tcW w:w="4512" w:type="dxa"/>
+            <w:tcW w:w="2035" w:type="dxa"/>
             <w:tcBorders>
               <w:top w:val="single" w:sz="4" w:space="0" w:color="BFC7D1"/>
               <w:left w:val="single" w:sz="4" w:space="0" w:color="BFC7D1"/>
@@ -8776,7 +8776,7 @@
         <w:trPr/>
         <w:tc>
           <w:tcPr>
-            <w:tcW w:w="4513" w:type="dxa"/>
+            <w:tcW w:w="6978" w:type="dxa"/>
             <w:tcBorders>
               <w:top w:val="single" w:sz="4" w:space="0" w:color="BFC7D1"/>
               <w:left w:val="single" w:sz="4" w:space="0" w:color="BFC7D1"/>
@@ -8813,7 +8813,7 @@
         </w:tc>
         <w:tc>
           <w:tcPr>
-            <w:tcW w:w="4512" w:type="dxa"/>
+            <w:tcW w:w="2035" w:type="dxa"/>
             <w:tcBorders>
               <w:top w:val="single" w:sz="4" w:space="0" w:color="BFC7D1"/>
               <w:left w:val="single" w:sz="4" w:space="0" w:color="BFC7D1"/>
@@ -8853,7 +8853,7 @@
         <w:trPr/>
         <w:tc>
           <w:tcPr>
-            <w:tcW w:w="4513" w:type="dxa"/>
+            <w:tcW w:w="6978" w:type="dxa"/>
             <w:tcBorders>
               <w:top w:val="single" w:sz="4" w:space="0" w:color="BFC7D1"/>
               <w:left w:val="single" w:sz="4" w:space="0" w:color="BFC7D1"/>
@@ -8890,7 +8890,7 @@
         </w:tc>
         <w:tc>
           <w:tcPr>
-            <w:tcW w:w="4512" w:type="dxa"/>
+            <w:tcW w:w="2035" w:type="dxa"/>
             <w:tcBorders>
               <w:top w:val="single" w:sz="4" w:space="0" w:color="BFC7D1"/>
               <w:left w:val="single" w:sz="4" w:space="0" w:color="BFC7D1"/>
@@ -8957,7 +8957,7 @@
         <w:pStyle w:val="Heading2"/>
         <w:rPr/>
       </w:pPr>
-      <w:bookmarkStart w:id="28" w:name="__RefHeading___Toc18963_1603226370"/>
+      <w:bookmarkStart w:id="28" w:name="__RefHeading___Toc38108_2679730275"/>
       <w:bookmarkEnd w:id="28"/>
       <w:r>
         <w:rPr>
@@ -9053,7 +9053,7 @@
         <w:pStyle w:val="Heading1"/>
         <w:rPr/>
       </w:pPr>
-      <w:bookmarkStart w:id="29" w:name="__RefHeading___Toc18965_1603226370"/>
+      <w:bookmarkStart w:id="29" w:name="__RefHeading___Toc38110_2679730275"/>
       <w:bookmarkEnd w:id="29"/>
       <w:r>
         <w:rPr>
@@ -9070,7 +9070,7 @@
         <w:pStyle w:val="Heading2"/>
         <w:rPr/>
       </w:pPr>
-      <w:bookmarkStart w:id="30" w:name="__RefHeading___Toc18967_1603226370"/>
+      <w:bookmarkStart w:id="30" w:name="__RefHeading___Toc38112_2679730275"/>
       <w:bookmarkEnd w:id="30"/>
       <w:r>
         <w:rPr>
@@ -9273,7 +9273,7 @@
         <w:pStyle w:val="Heading2"/>
         <w:rPr/>
       </w:pPr>
-      <w:bookmarkStart w:id="31" w:name="__RefHeading___Toc18969_1603226370"/>
+      <w:bookmarkStart w:id="31" w:name="__RefHeading___Toc38114_2679730275"/>
       <w:bookmarkEnd w:id="31"/>
       <w:r>
         <w:rPr>
@@ -9288,7 +9288,7 @@
     <w:tbl>
       <w:tblPr>
         <w:tblStyle w:val="TableGrid"/>
-        <w:tblW w:w="9027" w:type="dxa"/>
+        <w:tblW w:w="9014" w:type="dxa"/>
         <w:jc w:val="left"/>
         <w:tblInd w:w="0" w:type="dxa"/>
         <w:tblLayout w:type="fixed"/>
@@ -9301,9 +9301,9 @@
         <w:tblLook w:val="04a0" w:noHBand="0" w:noVBand="1" w:firstColumn="1" w:lastRow="0" w:lastColumn="0" w:firstRow="1"/>
       </w:tblPr>
       <w:tblGrid>
-        <w:gridCol w:w="3009"/>
-        <w:gridCol w:w="3009"/>
-        <w:gridCol w:w="3009"/>
+        <w:gridCol w:w="3481"/>
+        <w:gridCol w:w="4283"/>
+        <w:gridCol w:w="1250"/>
       </w:tblGrid>
       <w:tr>
         <w:trPr>
@@ -9311,7 +9311,7 @@
         </w:trPr>
         <w:tc>
           <w:tcPr>
-            <w:tcW w:w="3009" w:type="dxa"/>
+            <w:tcW w:w="3481" w:type="dxa"/>
             <w:tcBorders>
               <w:top w:val="single" w:sz="4" w:space="0" w:color="BFC7D1"/>
               <w:left w:val="single" w:sz="4" w:space="0" w:color="BFC7D1"/>
@@ -9350,7 +9350,7 @@
         </w:tc>
         <w:tc>
           <w:tcPr>
-            <w:tcW w:w="3009" w:type="dxa"/>
+            <w:tcW w:w="4283" w:type="dxa"/>
             <w:tcBorders>
               <w:top w:val="single" w:sz="4" w:space="0" w:color="BFC7D1"/>
               <w:left w:val="single" w:sz="4" w:space="0" w:color="BFC7D1"/>
@@ -9389,7 +9389,7 @@
         </w:tc>
         <w:tc>
           <w:tcPr>
-            <w:tcW w:w="3009" w:type="dxa"/>
+            <w:tcW w:w="1250" w:type="dxa"/>
             <w:tcBorders>
               <w:top w:val="single" w:sz="4" w:space="0" w:color="BFC7D1"/>
               <w:left w:val="single" w:sz="4" w:space="0" w:color="BFC7D1"/>
@@ -9431,7 +9431,7 @@
         <w:trPr/>
         <w:tc>
           <w:tcPr>
-            <w:tcW w:w="3009" w:type="dxa"/>
+            <w:tcW w:w="3481" w:type="dxa"/>
             <w:tcBorders>
               <w:top w:val="single" w:sz="4" w:space="0" w:color="BFC7D1"/>
               <w:left w:val="single" w:sz="4" w:space="0" w:color="BFC7D1"/>
@@ -9468,7 +9468,7 @@
         </w:tc>
         <w:tc>
           <w:tcPr>
-            <w:tcW w:w="3009" w:type="dxa"/>
+            <w:tcW w:w="4283" w:type="dxa"/>
             <w:tcBorders>
               <w:top w:val="single" w:sz="4" w:space="0" w:color="BFC7D1"/>
               <w:left w:val="single" w:sz="4" w:space="0" w:color="BFC7D1"/>
@@ -9505,7 +9505,7 @@
         </w:tc>
         <w:tc>
           <w:tcPr>
-            <w:tcW w:w="3009" w:type="dxa"/>
+            <w:tcW w:w="1250" w:type="dxa"/>
             <w:tcBorders>
               <w:top w:val="single" w:sz="4" w:space="0" w:color="BFC7D1"/>
               <w:left w:val="single" w:sz="4" w:space="0" w:color="BFC7D1"/>
@@ -9545,7 +9545,7 @@
         <w:trPr/>
         <w:tc>
           <w:tcPr>
-            <w:tcW w:w="3009" w:type="dxa"/>
+            <w:tcW w:w="3481" w:type="dxa"/>
             <w:tcBorders>
               <w:top w:val="single" w:sz="4" w:space="0" w:color="BFC7D1"/>
               <w:left w:val="single" w:sz="4" w:space="0" w:color="BFC7D1"/>
@@ -9582,7 +9582,7 @@
         </w:tc>
         <w:tc>
           <w:tcPr>
-            <w:tcW w:w="3009" w:type="dxa"/>
+            <w:tcW w:w="4283" w:type="dxa"/>
             <w:tcBorders>
               <w:top w:val="single" w:sz="4" w:space="0" w:color="BFC7D1"/>
               <w:left w:val="single" w:sz="4" w:space="0" w:color="BFC7D1"/>
@@ -9619,7 +9619,7 @@
         </w:tc>
         <w:tc>
           <w:tcPr>
-            <w:tcW w:w="3009" w:type="dxa"/>
+            <w:tcW w:w="1250" w:type="dxa"/>
             <w:tcBorders>
               <w:top w:val="single" w:sz="4" w:space="0" w:color="BFC7D1"/>
               <w:left w:val="single" w:sz="4" w:space="0" w:color="BFC7D1"/>
@@ -9659,7 +9659,7 @@
         <w:trPr/>
         <w:tc>
           <w:tcPr>
-            <w:tcW w:w="3009" w:type="dxa"/>
+            <w:tcW w:w="3481" w:type="dxa"/>
             <w:tcBorders>
               <w:top w:val="single" w:sz="4" w:space="0" w:color="BFC7D1"/>
               <w:left w:val="single" w:sz="4" w:space="0" w:color="BFC7D1"/>
@@ -9696,7 +9696,7 @@
         </w:tc>
         <w:tc>
           <w:tcPr>
-            <w:tcW w:w="3009" w:type="dxa"/>
+            <w:tcW w:w="4283" w:type="dxa"/>
             <w:tcBorders>
               <w:top w:val="single" w:sz="4" w:space="0" w:color="BFC7D1"/>
               <w:left w:val="single" w:sz="4" w:space="0" w:color="BFC7D1"/>
@@ -9733,7 +9733,7 @@
         </w:tc>
         <w:tc>
           <w:tcPr>
-            <w:tcW w:w="3009" w:type="dxa"/>
+            <w:tcW w:w="1250" w:type="dxa"/>
             <w:tcBorders>
               <w:top w:val="single" w:sz="4" w:space="0" w:color="BFC7D1"/>
               <w:left w:val="single" w:sz="4" w:space="0" w:color="BFC7D1"/>
@@ -9773,7 +9773,7 @@
         <w:trPr/>
         <w:tc>
           <w:tcPr>
-            <w:tcW w:w="3009" w:type="dxa"/>
+            <w:tcW w:w="3481" w:type="dxa"/>
             <w:tcBorders>
               <w:top w:val="single" w:sz="4" w:space="0" w:color="BFC7D1"/>
               <w:left w:val="single" w:sz="4" w:space="0" w:color="BFC7D1"/>
@@ -9810,7 +9810,7 @@
         </w:tc>
         <w:tc>
           <w:tcPr>
-            <w:tcW w:w="3009" w:type="dxa"/>
+            <w:tcW w:w="4283" w:type="dxa"/>
             <w:tcBorders>
               <w:top w:val="single" w:sz="4" w:space="0" w:color="BFC7D1"/>
               <w:left w:val="single" w:sz="4" w:space="0" w:color="BFC7D1"/>
@@ -9847,7 +9847,7 @@
         </w:tc>
         <w:tc>
           <w:tcPr>
-            <w:tcW w:w="3009" w:type="dxa"/>
+            <w:tcW w:w="1250" w:type="dxa"/>
             <w:tcBorders>
               <w:top w:val="single" w:sz="4" w:space="0" w:color="BFC7D1"/>
               <w:left w:val="single" w:sz="4" w:space="0" w:color="BFC7D1"/>
@@ -9887,7 +9887,7 @@
         <w:trPr/>
         <w:tc>
           <w:tcPr>
-            <w:tcW w:w="3009" w:type="dxa"/>
+            <w:tcW w:w="3481" w:type="dxa"/>
             <w:tcBorders>
               <w:top w:val="single" w:sz="4" w:space="0" w:color="BFC7D1"/>
               <w:left w:val="single" w:sz="4" w:space="0" w:color="BFC7D1"/>
@@ -9924,7 +9924,7 @@
         </w:tc>
         <w:tc>
           <w:tcPr>
-            <w:tcW w:w="3009" w:type="dxa"/>
+            <w:tcW w:w="4283" w:type="dxa"/>
             <w:tcBorders>
               <w:top w:val="single" w:sz="4" w:space="0" w:color="BFC7D1"/>
               <w:left w:val="single" w:sz="4" w:space="0" w:color="BFC7D1"/>
@@ -9961,7 +9961,7 @@
         </w:tc>
         <w:tc>
           <w:tcPr>
-            <w:tcW w:w="3009" w:type="dxa"/>
+            <w:tcW w:w="1250" w:type="dxa"/>
             <w:tcBorders>
               <w:top w:val="single" w:sz="4" w:space="0" w:color="BFC7D1"/>
               <w:left w:val="single" w:sz="4" w:space="0" w:color="BFC7D1"/>
@@ -10001,7 +10001,7 @@
         <w:trPr/>
         <w:tc>
           <w:tcPr>
-            <w:tcW w:w="3009" w:type="dxa"/>
+            <w:tcW w:w="3481" w:type="dxa"/>
             <w:tcBorders>
               <w:top w:val="single" w:sz="4" w:space="0" w:color="BFC7D1"/>
               <w:left w:val="single" w:sz="4" w:space="0" w:color="BFC7D1"/>
@@ -10038,7 +10038,7 @@
         </w:tc>
         <w:tc>
           <w:tcPr>
-            <w:tcW w:w="3009" w:type="dxa"/>
+            <w:tcW w:w="4283" w:type="dxa"/>
             <w:tcBorders>
               <w:top w:val="single" w:sz="4" w:space="0" w:color="BFC7D1"/>
               <w:left w:val="single" w:sz="4" w:space="0" w:color="BFC7D1"/>
@@ -10075,7 +10075,7 @@
         </w:tc>
         <w:tc>
           <w:tcPr>
-            <w:tcW w:w="3009" w:type="dxa"/>
+            <w:tcW w:w="1250" w:type="dxa"/>
             <w:tcBorders>
               <w:top w:val="single" w:sz="4" w:space="0" w:color="BFC7D1"/>
               <w:left w:val="single" w:sz="4" w:space="0" w:color="BFC7D1"/>
@@ -10115,7 +10115,7 @@
         <w:trPr/>
         <w:tc>
           <w:tcPr>
-            <w:tcW w:w="3009" w:type="dxa"/>
+            <w:tcW w:w="3481" w:type="dxa"/>
             <w:tcBorders>
               <w:top w:val="single" w:sz="4" w:space="0" w:color="BFC7D1"/>
               <w:left w:val="single" w:sz="4" w:space="0" w:color="BFC7D1"/>
@@ -10152,7 +10152,7 @@
         </w:tc>
         <w:tc>
           <w:tcPr>
-            <w:tcW w:w="3009" w:type="dxa"/>
+            <w:tcW w:w="4283" w:type="dxa"/>
             <w:tcBorders>
               <w:top w:val="single" w:sz="4" w:space="0" w:color="BFC7D1"/>
               <w:left w:val="single" w:sz="4" w:space="0" w:color="BFC7D1"/>
@@ -10189,7 +10189,7 @@
         </w:tc>
         <w:tc>
           <w:tcPr>
-            <w:tcW w:w="3009" w:type="dxa"/>
+            <w:tcW w:w="1250" w:type="dxa"/>
             <w:tcBorders>
               <w:top w:val="single" w:sz="4" w:space="0" w:color="BFC7D1"/>
               <w:left w:val="single" w:sz="4" w:space="0" w:color="BFC7D1"/>
@@ -10241,7 +10241,7 @@
         <w:pStyle w:val="Heading2"/>
         <w:rPr/>
       </w:pPr>
-      <w:bookmarkStart w:id="32" w:name="__RefHeading___Toc18971_1603226370"/>
+      <w:bookmarkStart w:id="32" w:name="__RefHeading___Toc38116_2679730275"/>
       <w:bookmarkEnd w:id="32"/>
       <w:r>
         <w:rPr>
@@ -10276,7 +10276,7 @@
         <w:pStyle w:val="Heading1"/>
         <w:rPr/>
       </w:pPr>
-      <w:bookmarkStart w:id="33" w:name="__RefHeading___Toc18973_1603226370"/>
+      <w:bookmarkStart w:id="33" w:name="__RefHeading___Toc38118_2679730275"/>
       <w:bookmarkEnd w:id="33"/>
       <w:r>
         <w:rPr>
@@ -10391,7 +10391,7 @@
         <w:pStyle w:val="Heading1"/>
         <w:rPr/>
       </w:pPr>
-      <w:bookmarkStart w:id="34" w:name="__RefHeading___Toc18975_1603226370"/>
+      <w:bookmarkStart w:id="34" w:name="__RefHeading___Toc38120_2679730275"/>
       <w:bookmarkEnd w:id="34"/>
       <w:r>
         <w:rPr>
@@ -10468,7 +10468,7 @@
         <w:pStyle w:val="Heading1"/>
         <w:rPr/>
       </w:pPr>
-      <w:bookmarkStart w:id="35" w:name="__RefHeading___Toc18977_1603226370"/>
+      <w:bookmarkStart w:id="35" w:name="__RefHeading___Toc38122_2679730275"/>
       <w:bookmarkEnd w:id="35"/>
       <w:r>
         <w:rPr>
@@ -10712,7 +10712,7 @@
         <w:pStyle w:val="Heading1"/>
         <w:rPr/>
       </w:pPr>
-      <w:bookmarkStart w:id="36" w:name="__RefHeading___Toc18979_1603226370"/>
+      <w:bookmarkStart w:id="36" w:name="__RefHeading___Toc38124_2679730275"/>
       <w:bookmarkEnd w:id="36"/>
       <w:r>
         <w:rPr>
@@ -10884,7 +10884,7 @@
         <w:pStyle w:val="Heading1"/>
         <w:rPr/>
       </w:pPr>
-      <w:bookmarkStart w:id="37" w:name="__RefHeading___Toc18981_1603226370"/>
+      <w:bookmarkStart w:id="37" w:name="__RefHeading___Toc38126_2679730275"/>
       <w:bookmarkEnd w:id="37"/>
       <w:r>
         <w:rPr>
@@ -10980,7 +10980,7 @@
         <w:pStyle w:val="Heading1"/>
         <w:rPr/>
       </w:pPr>
-      <w:bookmarkStart w:id="38" w:name="__RefHeading___Toc18983_1603226370"/>
+      <w:bookmarkStart w:id="38" w:name="__RefHeading___Toc38128_2679730275"/>
       <w:bookmarkEnd w:id="38"/>
       <w:r>
         <w:rPr>
@@ -10995,7 +10995,7 @@
     <w:tbl>
       <w:tblPr>
         <w:tblStyle w:val="TableGrid"/>
-        <w:tblW w:w="9026" w:type="dxa"/>
+        <w:tblW w:w="9014" w:type="dxa"/>
         <w:jc w:val="left"/>
         <w:tblInd w:w="0" w:type="dxa"/>
         <w:tblLayout w:type="fixed"/>
@@ -11008,8 +11008,8 @@
         <w:tblLook w:val="04a0" w:noHBand="0" w:noVBand="1" w:firstColumn="1" w:lastRow="0" w:lastColumn="0" w:firstRow="1"/>
       </w:tblPr>
       <w:tblGrid>
-        <w:gridCol w:w="4513"/>
-        <w:gridCol w:w="4512"/>
+        <w:gridCol w:w="4507"/>
+        <w:gridCol w:w="4506"/>
       </w:tblGrid>
       <w:tr>
         <w:trPr>
@@ -11017,7 +11017,7 @@
         </w:trPr>
         <w:tc>
           <w:tcPr>
-            <w:tcW w:w="4513" w:type="dxa"/>
+            <w:tcW w:w="4507" w:type="dxa"/>
             <w:tcBorders>
               <w:top w:val="single" w:sz="4" w:space="0" w:color="BFC7D1"/>
               <w:left w:val="single" w:sz="4" w:space="0" w:color="BFC7D1"/>
@@ -11056,7 +11056,7 @@
         </w:tc>
         <w:tc>
           <w:tcPr>
-            <w:tcW w:w="4512" w:type="dxa"/>
+            <w:tcW w:w="4506" w:type="dxa"/>
             <w:tcBorders>
               <w:top w:val="single" w:sz="4" w:space="0" w:color="BFC7D1"/>
               <w:left w:val="single" w:sz="4" w:space="0" w:color="BFC7D1"/>
@@ -11098,7 +11098,7 @@
         <w:trPr/>
         <w:tc>
           <w:tcPr>
-            <w:tcW w:w="4513" w:type="dxa"/>
+            <w:tcW w:w="4507" w:type="dxa"/>
             <w:tcBorders>
               <w:top w:val="single" w:sz="4" w:space="0" w:color="BFC7D1"/>
               <w:left w:val="single" w:sz="4" w:space="0" w:color="BFC7D1"/>
@@ -11135,7 +11135,7 @@
         </w:tc>
         <w:tc>
           <w:tcPr>
-            <w:tcW w:w="4512" w:type="dxa"/>
+            <w:tcW w:w="4506" w:type="dxa"/>
             <w:tcBorders>
               <w:top w:val="single" w:sz="4" w:space="0" w:color="BFC7D1"/>
               <w:left w:val="single" w:sz="4" w:space="0" w:color="BFC7D1"/>
@@ -11175,7 +11175,7 @@
         <w:trPr/>
         <w:tc>
           <w:tcPr>
-            <w:tcW w:w="4513" w:type="dxa"/>
+            <w:tcW w:w="4507" w:type="dxa"/>
             <w:tcBorders>
               <w:top w:val="single" w:sz="4" w:space="0" w:color="BFC7D1"/>
               <w:left w:val="single" w:sz="4" w:space="0" w:color="BFC7D1"/>
@@ -11212,7 +11212,7 @@
         </w:tc>
         <w:tc>
           <w:tcPr>
-            <w:tcW w:w="4512" w:type="dxa"/>
+            <w:tcW w:w="4506" w:type="dxa"/>
             <w:tcBorders>
               <w:top w:val="single" w:sz="4" w:space="0" w:color="BFC7D1"/>
               <w:left w:val="single" w:sz="4" w:space="0" w:color="BFC7D1"/>
@@ -11252,7 +11252,7 @@
         <w:trPr/>
         <w:tc>
           <w:tcPr>
-            <w:tcW w:w="4513" w:type="dxa"/>
+            <w:tcW w:w="4507" w:type="dxa"/>
             <w:tcBorders>
               <w:top w:val="single" w:sz="4" w:space="0" w:color="BFC7D1"/>
               <w:left w:val="single" w:sz="4" w:space="0" w:color="BFC7D1"/>
@@ -11289,7 +11289,7 @@
         </w:tc>
         <w:tc>
           <w:tcPr>
-            <w:tcW w:w="4512" w:type="dxa"/>
+            <w:tcW w:w="4506" w:type="dxa"/>
             <w:tcBorders>
               <w:top w:val="single" w:sz="4" w:space="0" w:color="BFC7D1"/>
               <w:left w:val="single" w:sz="4" w:space="0" w:color="BFC7D1"/>
@@ -11329,7 +11329,7 @@
         <w:trPr/>
         <w:tc>
           <w:tcPr>
-            <w:tcW w:w="4513" w:type="dxa"/>
+            <w:tcW w:w="4507" w:type="dxa"/>
             <w:tcBorders>
               <w:top w:val="single" w:sz="4" w:space="0" w:color="BFC7D1"/>
               <w:left w:val="single" w:sz="4" w:space="0" w:color="BFC7D1"/>
@@ -11366,7 +11366,7 @@
         </w:tc>
         <w:tc>
           <w:tcPr>
-            <w:tcW w:w="4512" w:type="dxa"/>
+            <w:tcW w:w="4506" w:type="dxa"/>
             <w:tcBorders>
               <w:top w:val="single" w:sz="4" w:space="0" w:color="BFC7D1"/>
               <w:left w:val="single" w:sz="4" w:space="0" w:color="BFC7D1"/>
@@ -11421,7 +11421,7 @@
         <w:pStyle w:val="Heading1"/>
         <w:rPr/>
       </w:pPr>
-      <w:bookmarkStart w:id="39" w:name="__RefHeading___Toc18985_1603226370"/>
+      <w:bookmarkStart w:id="39" w:name="__RefHeading___Toc38130_2679730275"/>
       <w:bookmarkEnd w:id="39"/>
       <w:r>
         <w:rPr>
@@ -11436,7 +11436,7 @@
     <w:tbl>
       <w:tblPr>
         <w:tblStyle w:val="TableGrid"/>
-        <w:tblW w:w="9026" w:type="dxa"/>
+        <w:tblW w:w="9014" w:type="dxa"/>
         <w:jc w:val="left"/>
         <w:tblInd w:w="0" w:type="dxa"/>
         <w:tblLayout w:type="fixed"/>
@@ -11449,11 +11449,11 @@
         <w:tblLook w:val="04a0" w:noHBand="0" w:noVBand="1" w:firstColumn="1" w:lastRow="0" w:lastColumn="0" w:firstRow="1"/>
       </w:tblPr>
       <w:tblGrid>
-        <w:gridCol w:w="1805"/>
-        <w:gridCol w:w="1805"/>
-        <w:gridCol w:w="1805"/>
-        <w:gridCol w:w="1805"/>
-        <w:gridCol w:w="1806"/>
+        <w:gridCol w:w="2658"/>
+        <w:gridCol w:w="1501"/>
+        <w:gridCol w:w="2196"/>
+        <w:gridCol w:w="1618"/>
+        <w:gridCol w:w="1041"/>
       </w:tblGrid>
       <w:tr>
         <w:trPr>
@@ -11461,7 +11461,7 @@
         </w:trPr>
         <w:tc>
           <w:tcPr>
-            <w:tcW w:w="1805" w:type="dxa"/>
+            <w:tcW w:w="2658" w:type="dxa"/>
             <w:tcBorders>
               <w:top w:val="single" w:sz="4" w:space="0" w:color="BFC7D1"/>
               <w:left w:val="single" w:sz="4" w:space="0" w:color="BFC7D1"/>
@@ -11500,7 +11500,7 @@
         </w:tc>
         <w:tc>
           <w:tcPr>
-            <w:tcW w:w="1805" w:type="dxa"/>
+            <w:tcW w:w="1501" w:type="dxa"/>
             <w:tcBorders>
               <w:top w:val="single" w:sz="4" w:space="0" w:color="BFC7D1"/>
               <w:left w:val="single" w:sz="4" w:space="0" w:color="BFC7D1"/>
@@ -11539,7 +11539,7 @@
         </w:tc>
         <w:tc>
           <w:tcPr>
-            <w:tcW w:w="1805" w:type="dxa"/>
+            <w:tcW w:w="2196" w:type="dxa"/>
             <w:tcBorders>
               <w:top w:val="single" w:sz="4" w:space="0" w:color="BFC7D1"/>
               <w:left w:val="single" w:sz="4" w:space="0" w:color="BFC7D1"/>
@@ -11578,7 +11578,7 @@
         </w:tc>
         <w:tc>
           <w:tcPr>
-            <w:tcW w:w="1805" w:type="dxa"/>
+            <w:tcW w:w="1618" w:type="dxa"/>
             <w:tcBorders>
               <w:top w:val="single" w:sz="4" w:space="0" w:color="BFC7D1"/>
               <w:left w:val="single" w:sz="4" w:space="0" w:color="BFC7D1"/>
@@ -11617,7 +11617,7 @@
         </w:tc>
         <w:tc>
           <w:tcPr>
-            <w:tcW w:w="1806" w:type="dxa"/>
+            <w:tcW w:w="1041" w:type="dxa"/>
             <w:tcBorders>
               <w:top w:val="single" w:sz="4" w:space="0" w:color="BFC7D1"/>
               <w:left w:val="single" w:sz="4" w:space="0" w:color="BFC7D1"/>
@@ -11659,7 +11659,7 @@
         <w:trPr/>
         <w:tc>
           <w:tcPr>
-            <w:tcW w:w="1805" w:type="dxa"/>
+            <w:tcW w:w="2658" w:type="dxa"/>
             <w:tcBorders>
               <w:top w:val="single" w:sz="4" w:space="0" w:color="BFC7D1"/>
               <w:left w:val="single" w:sz="4" w:space="0" w:color="BFC7D1"/>
@@ -11696,7 +11696,7 @@
         </w:tc>
         <w:tc>
           <w:tcPr>
-            <w:tcW w:w="1805" w:type="dxa"/>
+            <w:tcW w:w="1501" w:type="dxa"/>
             <w:tcBorders>
               <w:top w:val="single" w:sz="4" w:space="0" w:color="BFC7D1"/>
               <w:left w:val="single" w:sz="4" w:space="0" w:color="BFC7D1"/>
@@ -11733,7 +11733,7 @@
         </w:tc>
         <w:tc>
           <w:tcPr>
-            <w:tcW w:w="1805" w:type="dxa"/>
+            <w:tcW w:w="2196" w:type="dxa"/>
             <w:tcBorders>
               <w:top w:val="single" w:sz="4" w:space="0" w:color="BFC7D1"/>
               <w:left w:val="single" w:sz="4" w:space="0" w:color="BFC7D1"/>
@@ -11770,7 +11770,7 @@
         </w:tc>
         <w:tc>
           <w:tcPr>
-            <w:tcW w:w="1805" w:type="dxa"/>
+            <w:tcW w:w="1618" w:type="dxa"/>
             <w:tcBorders>
               <w:top w:val="single" w:sz="4" w:space="0" w:color="BFC7D1"/>
               <w:left w:val="single" w:sz="4" w:space="0" w:color="BFC7D1"/>
@@ -11807,7 +11807,7 @@
         </w:tc>
         <w:tc>
           <w:tcPr>
-            <w:tcW w:w="1806" w:type="dxa"/>
+            <w:tcW w:w="1041" w:type="dxa"/>
             <w:tcBorders>
               <w:top w:val="single" w:sz="4" w:space="0" w:color="BFC7D1"/>
               <w:left w:val="single" w:sz="4" w:space="0" w:color="BFC7D1"/>
@@ -11847,7 +11847,7 @@
         <w:trPr/>
         <w:tc>
           <w:tcPr>
-            <w:tcW w:w="1805" w:type="dxa"/>
+            <w:tcW w:w="2658" w:type="dxa"/>
             <w:tcBorders>
               <w:top w:val="single" w:sz="4" w:space="0" w:color="BFC7D1"/>
               <w:left w:val="single" w:sz="4" w:space="0" w:color="BFC7D1"/>
@@ -11884,7 +11884,7 @@
         </w:tc>
         <w:tc>
           <w:tcPr>
-            <w:tcW w:w="1805" w:type="dxa"/>
+            <w:tcW w:w="1501" w:type="dxa"/>
             <w:tcBorders>
               <w:top w:val="single" w:sz="4" w:space="0" w:color="BFC7D1"/>
               <w:left w:val="single" w:sz="4" w:space="0" w:color="BFC7D1"/>
@@ -11921,7 +11921,7 @@
         </w:tc>
         <w:tc>
           <w:tcPr>
-            <w:tcW w:w="1805" w:type="dxa"/>
+            <w:tcW w:w="2196" w:type="dxa"/>
             <w:tcBorders>
               <w:top w:val="single" w:sz="4" w:space="0" w:color="BFC7D1"/>
               <w:left w:val="single" w:sz="4" w:space="0" w:color="BFC7D1"/>
@@ -11958,7 +11958,7 @@
         </w:tc>
         <w:tc>
           <w:tcPr>
-            <w:tcW w:w="1805" w:type="dxa"/>
+            <w:tcW w:w="1618" w:type="dxa"/>
             <w:tcBorders>
               <w:top w:val="single" w:sz="4" w:space="0" w:color="BFC7D1"/>
               <w:left w:val="single" w:sz="4" w:space="0" w:color="BFC7D1"/>
@@ -11995,7 +11995,7 @@
         </w:tc>
         <w:tc>
           <w:tcPr>
-            <w:tcW w:w="1806" w:type="dxa"/>
+            <w:tcW w:w="1041" w:type="dxa"/>
             <w:tcBorders>
               <w:top w:val="single" w:sz="4" w:space="0" w:color="BFC7D1"/>
               <w:left w:val="single" w:sz="4" w:space="0" w:color="BFC7D1"/>
@@ -12035,7 +12035,7 @@
         <w:trPr/>
         <w:tc>
           <w:tcPr>
-            <w:tcW w:w="1805" w:type="dxa"/>
+            <w:tcW w:w="2658" w:type="dxa"/>
             <w:tcBorders>
               <w:top w:val="single" w:sz="4" w:space="0" w:color="BFC7D1"/>
               <w:left w:val="single" w:sz="4" w:space="0" w:color="BFC7D1"/>
@@ -12072,7 +12072,7 @@
         </w:tc>
         <w:tc>
           <w:tcPr>
-            <w:tcW w:w="1805" w:type="dxa"/>
+            <w:tcW w:w="1501" w:type="dxa"/>
             <w:tcBorders>
               <w:top w:val="single" w:sz="4" w:space="0" w:color="BFC7D1"/>
               <w:left w:val="single" w:sz="4" w:space="0" w:color="BFC7D1"/>
@@ -12109,7 +12109,7 @@
         </w:tc>
         <w:tc>
           <w:tcPr>
-            <w:tcW w:w="1805" w:type="dxa"/>
+            <w:tcW w:w="2196" w:type="dxa"/>
             <w:tcBorders>
               <w:top w:val="single" w:sz="4" w:space="0" w:color="BFC7D1"/>
               <w:left w:val="single" w:sz="4" w:space="0" w:color="BFC7D1"/>
@@ -12146,7 +12146,7 @@
         </w:tc>
         <w:tc>
           <w:tcPr>
-            <w:tcW w:w="1805" w:type="dxa"/>
+            <w:tcW w:w="1618" w:type="dxa"/>
             <w:tcBorders>
               <w:top w:val="single" w:sz="4" w:space="0" w:color="BFC7D1"/>
               <w:left w:val="single" w:sz="4" w:space="0" w:color="BFC7D1"/>
@@ -12183,7 +12183,7 @@
         </w:tc>
         <w:tc>
           <w:tcPr>
-            <w:tcW w:w="1806" w:type="dxa"/>
+            <w:tcW w:w="1041" w:type="dxa"/>
             <w:tcBorders>
               <w:top w:val="single" w:sz="4" w:space="0" w:color="BFC7D1"/>
               <w:left w:val="single" w:sz="4" w:space="0" w:color="BFC7D1"/>
@@ -12223,7 +12223,7 @@
         <w:trPr/>
         <w:tc>
           <w:tcPr>
-            <w:tcW w:w="1805" w:type="dxa"/>
+            <w:tcW w:w="2658" w:type="dxa"/>
             <w:tcBorders>
               <w:top w:val="single" w:sz="4" w:space="0" w:color="BFC7D1"/>
               <w:left w:val="single" w:sz="4" w:space="0" w:color="BFC7D1"/>
@@ -12260,7 +12260,7 @@
         </w:tc>
         <w:tc>
           <w:tcPr>
-            <w:tcW w:w="1805" w:type="dxa"/>
+            <w:tcW w:w="1501" w:type="dxa"/>
             <w:tcBorders>
               <w:top w:val="single" w:sz="4" w:space="0" w:color="BFC7D1"/>
               <w:left w:val="single" w:sz="4" w:space="0" w:color="BFC7D1"/>
@@ -12297,7 +12297,7 @@
         </w:tc>
         <w:tc>
           <w:tcPr>
-            <w:tcW w:w="1805" w:type="dxa"/>
+            <w:tcW w:w="2196" w:type="dxa"/>
             <w:tcBorders>
               <w:top w:val="single" w:sz="4" w:space="0" w:color="BFC7D1"/>
               <w:left w:val="single" w:sz="4" w:space="0" w:color="BFC7D1"/>
@@ -12334,7 +12334,7 @@
         </w:tc>
         <w:tc>
           <w:tcPr>
-            <w:tcW w:w="1805" w:type="dxa"/>
+            <w:tcW w:w="1618" w:type="dxa"/>
             <w:tcBorders>
               <w:top w:val="single" w:sz="4" w:space="0" w:color="BFC7D1"/>
               <w:left w:val="single" w:sz="4" w:space="0" w:color="BFC7D1"/>
@@ -12371,7 +12371,7 @@
         </w:tc>
         <w:tc>
           <w:tcPr>
-            <w:tcW w:w="1806" w:type="dxa"/>
+            <w:tcW w:w="1041" w:type="dxa"/>
             <w:tcBorders>
               <w:top w:val="single" w:sz="4" w:space="0" w:color="BFC7D1"/>
               <w:left w:val="single" w:sz="4" w:space="0" w:color="BFC7D1"/>
@@ -12411,7 +12411,7 @@
         <w:trPr/>
         <w:tc>
           <w:tcPr>
-            <w:tcW w:w="1805" w:type="dxa"/>
+            <w:tcW w:w="2658" w:type="dxa"/>
             <w:tcBorders>
               <w:top w:val="single" w:sz="4" w:space="0" w:color="BFC7D1"/>
               <w:left w:val="single" w:sz="4" w:space="0" w:color="BFC7D1"/>
@@ -12448,7 +12448,7 @@
         </w:tc>
         <w:tc>
           <w:tcPr>
-            <w:tcW w:w="1805" w:type="dxa"/>
+            <w:tcW w:w="1501" w:type="dxa"/>
             <w:tcBorders>
               <w:top w:val="single" w:sz="4" w:space="0" w:color="BFC7D1"/>
               <w:left w:val="single" w:sz="4" w:space="0" w:color="BFC7D1"/>
@@ -12485,7 +12485,7 @@
         </w:tc>
         <w:tc>
           <w:tcPr>
-            <w:tcW w:w="1805" w:type="dxa"/>
+            <w:tcW w:w="2196" w:type="dxa"/>
             <w:tcBorders>
               <w:top w:val="single" w:sz="4" w:space="0" w:color="BFC7D1"/>
               <w:left w:val="single" w:sz="4" w:space="0" w:color="BFC7D1"/>
@@ -12522,7 +12522,7 @@
         </w:tc>
         <w:tc>
           <w:tcPr>
-            <w:tcW w:w="1805" w:type="dxa"/>
+            <w:tcW w:w="1618" w:type="dxa"/>
             <w:tcBorders>
               <w:top w:val="single" w:sz="4" w:space="0" w:color="BFC7D1"/>
               <w:left w:val="single" w:sz="4" w:space="0" w:color="BFC7D1"/>
@@ -12559,7 +12559,7 @@
         </w:tc>
         <w:tc>
           <w:tcPr>
-            <w:tcW w:w="1806" w:type="dxa"/>
+            <w:tcW w:w="1041" w:type="dxa"/>
             <w:tcBorders>
               <w:top w:val="single" w:sz="4" w:space="0" w:color="BFC7D1"/>
               <w:left w:val="single" w:sz="4" w:space="0" w:color="BFC7D1"/>
@@ -12599,7 +12599,7 @@
         <w:trPr/>
         <w:tc>
           <w:tcPr>
-            <w:tcW w:w="1805" w:type="dxa"/>
+            <w:tcW w:w="2658" w:type="dxa"/>
             <w:tcBorders>
               <w:top w:val="single" w:sz="4" w:space="0" w:color="BFC7D1"/>
               <w:left w:val="single" w:sz="4" w:space="0" w:color="BFC7D1"/>
@@ -12636,7 +12636,7 @@
         </w:tc>
         <w:tc>
           <w:tcPr>
-            <w:tcW w:w="1805" w:type="dxa"/>
+            <w:tcW w:w="1501" w:type="dxa"/>
             <w:tcBorders>
               <w:top w:val="single" w:sz="4" w:space="0" w:color="BFC7D1"/>
               <w:left w:val="single" w:sz="4" w:space="0" w:color="BFC7D1"/>
@@ -12673,7 +12673,7 @@
         </w:tc>
         <w:tc>
           <w:tcPr>
-            <w:tcW w:w="1805" w:type="dxa"/>
+            <w:tcW w:w="2196" w:type="dxa"/>
             <w:tcBorders>
               <w:top w:val="single" w:sz="4" w:space="0" w:color="BFC7D1"/>
               <w:left w:val="single" w:sz="4" w:space="0" w:color="BFC7D1"/>
@@ -12710,7 +12710,7 @@
         </w:tc>
         <w:tc>
           <w:tcPr>
-            <w:tcW w:w="1805" w:type="dxa"/>
+            <w:tcW w:w="1618" w:type="dxa"/>
             <w:tcBorders>
               <w:top w:val="single" w:sz="4" w:space="0" w:color="BFC7D1"/>
               <w:left w:val="single" w:sz="4" w:space="0" w:color="BFC7D1"/>
@@ -12747,7 +12747,7 @@
         </w:tc>
         <w:tc>
           <w:tcPr>
-            <w:tcW w:w="1806" w:type="dxa"/>
+            <w:tcW w:w="1041" w:type="dxa"/>
             <w:tcBorders>
               <w:top w:val="single" w:sz="4" w:space="0" w:color="BFC7D1"/>
               <w:left w:val="single" w:sz="4" w:space="0" w:color="BFC7D1"/>
@@ -12787,7 +12787,7 @@
         <w:trPr/>
         <w:tc>
           <w:tcPr>
-            <w:tcW w:w="1805" w:type="dxa"/>
+            <w:tcW w:w="2658" w:type="dxa"/>
             <w:tcBorders>
               <w:top w:val="single" w:sz="4" w:space="0" w:color="BFC7D1"/>
               <w:left w:val="single" w:sz="4" w:space="0" w:color="BFC7D1"/>
@@ -12824,7 +12824,7 @@
         </w:tc>
         <w:tc>
           <w:tcPr>
-            <w:tcW w:w="1805" w:type="dxa"/>
+            <w:tcW w:w="1501" w:type="dxa"/>
             <w:tcBorders>
               <w:top w:val="single" w:sz="4" w:space="0" w:color="BFC7D1"/>
               <w:left w:val="single" w:sz="4" w:space="0" w:color="BFC7D1"/>
@@ -12861,7 +12861,7 @@
         </w:tc>
         <w:tc>
           <w:tcPr>
-            <w:tcW w:w="1805" w:type="dxa"/>
+            <w:tcW w:w="2196" w:type="dxa"/>
             <w:tcBorders>
               <w:top w:val="single" w:sz="4" w:space="0" w:color="BFC7D1"/>
               <w:left w:val="single" w:sz="4" w:space="0" w:color="BFC7D1"/>
@@ -12898,7 +12898,7 @@
         </w:tc>
         <w:tc>
           <w:tcPr>
-            <w:tcW w:w="1805" w:type="dxa"/>
+            <w:tcW w:w="1618" w:type="dxa"/>
             <w:tcBorders>
               <w:top w:val="single" w:sz="4" w:space="0" w:color="BFC7D1"/>
               <w:left w:val="single" w:sz="4" w:space="0" w:color="BFC7D1"/>
@@ -12935,7 +12935,7 @@
         </w:tc>
         <w:tc>
           <w:tcPr>
-            <w:tcW w:w="1806" w:type="dxa"/>
+            <w:tcW w:w="1041" w:type="dxa"/>
             <w:tcBorders>
               <w:top w:val="single" w:sz="4" w:space="0" w:color="BFC7D1"/>
               <w:left w:val="single" w:sz="4" w:space="0" w:color="BFC7D1"/>
@@ -12975,7 +12975,7 @@
         <w:trPr/>
         <w:tc>
           <w:tcPr>
-            <w:tcW w:w="1805" w:type="dxa"/>
+            <w:tcW w:w="2658" w:type="dxa"/>
             <w:tcBorders>
               <w:top w:val="single" w:sz="4" w:space="0" w:color="BFC7D1"/>
               <w:left w:val="single" w:sz="4" w:space="0" w:color="BFC7D1"/>
@@ -13012,7 +13012,7 @@
         </w:tc>
         <w:tc>
           <w:tcPr>
-            <w:tcW w:w="1805" w:type="dxa"/>
+            <w:tcW w:w="1501" w:type="dxa"/>
             <w:tcBorders>
               <w:top w:val="single" w:sz="4" w:space="0" w:color="BFC7D1"/>
               <w:left w:val="single" w:sz="4" w:space="0" w:color="BFC7D1"/>
@@ -13049,7 +13049,7 @@
         </w:tc>
         <w:tc>
           <w:tcPr>
-            <w:tcW w:w="1805" w:type="dxa"/>
+            <w:tcW w:w="2196" w:type="dxa"/>
             <w:tcBorders>
               <w:top w:val="single" w:sz="4" w:space="0" w:color="BFC7D1"/>
               <w:left w:val="single" w:sz="4" w:space="0" w:color="BFC7D1"/>
@@ -13086,7 +13086,7 @@
         </w:tc>
         <w:tc>
           <w:tcPr>
-            <w:tcW w:w="1805" w:type="dxa"/>
+            <w:tcW w:w="1618" w:type="dxa"/>
             <w:tcBorders>
               <w:top w:val="single" w:sz="4" w:space="0" w:color="BFC7D1"/>
               <w:left w:val="single" w:sz="4" w:space="0" w:color="BFC7D1"/>
@@ -13123,7 +13123,7 @@
         </w:tc>
         <w:tc>
           <w:tcPr>
-            <w:tcW w:w="1806" w:type="dxa"/>
+            <w:tcW w:w="1041" w:type="dxa"/>
             <w:tcBorders>
               <w:top w:val="single" w:sz="4" w:space="0" w:color="BFC7D1"/>
               <w:left w:val="single" w:sz="4" w:space="0" w:color="BFC7D1"/>
@@ -13163,7 +13163,7 @@
         <w:trPr/>
         <w:tc>
           <w:tcPr>
-            <w:tcW w:w="1805" w:type="dxa"/>
+            <w:tcW w:w="2658" w:type="dxa"/>
             <w:tcBorders>
               <w:top w:val="single" w:sz="4" w:space="0" w:color="BFC7D1"/>
               <w:left w:val="single" w:sz="4" w:space="0" w:color="BFC7D1"/>
@@ -13200,7 +13200,7 @@
         </w:tc>
         <w:tc>
           <w:tcPr>
-            <w:tcW w:w="1805" w:type="dxa"/>
+            <w:tcW w:w="1501" w:type="dxa"/>
             <w:tcBorders>
               <w:top w:val="single" w:sz="4" w:space="0" w:color="BFC7D1"/>
               <w:left w:val="single" w:sz="4" w:space="0" w:color="BFC7D1"/>
@@ -13237,7 +13237,7 @@
         </w:tc>
         <w:tc>
           <w:tcPr>
-            <w:tcW w:w="1805" w:type="dxa"/>
+            <w:tcW w:w="2196" w:type="dxa"/>
             <w:tcBorders>
               <w:top w:val="single" w:sz="4" w:space="0" w:color="BFC7D1"/>
               <w:left w:val="single" w:sz="4" w:space="0" w:color="BFC7D1"/>
@@ -13274,7 +13274,7 @@
         </w:tc>
         <w:tc>
           <w:tcPr>
-            <w:tcW w:w="1805" w:type="dxa"/>
+            <w:tcW w:w="1618" w:type="dxa"/>
             <w:tcBorders>
               <w:top w:val="single" w:sz="4" w:space="0" w:color="BFC7D1"/>
               <w:left w:val="single" w:sz="4" w:space="0" w:color="BFC7D1"/>
@@ -13311,7 +13311,7 @@
         </w:tc>
         <w:tc>
           <w:tcPr>
-            <w:tcW w:w="1806" w:type="dxa"/>
+            <w:tcW w:w="1041" w:type="dxa"/>
             <w:tcBorders>
               <w:top w:val="single" w:sz="4" w:space="0" w:color="BFC7D1"/>
               <w:left w:val="single" w:sz="4" w:space="0" w:color="BFC7D1"/>
@@ -13351,7 +13351,7 @@
         <w:trPr/>
         <w:tc>
           <w:tcPr>
-            <w:tcW w:w="1805" w:type="dxa"/>
+            <w:tcW w:w="2658" w:type="dxa"/>
             <w:tcBorders>
               <w:top w:val="single" w:sz="4" w:space="0" w:color="BFC7D1"/>
               <w:left w:val="single" w:sz="4" w:space="0" w:color="BFC7D1"/>
@@ -13388,7 +13388,7 @@
         </w:tc>
         <w:tc>
           <w:tcPr>
-            <w:tcW w:w="1805" w:type="dxa"/>
+            <w:tcW w:w="1501" w:type="dxa"/>
             <w:tcBorders>
               <w:top w:val="single" w:sz="4" w:space="0" w:color="BFC7D1"/>
               <w:left w:val="single" w:sz="4" w:space="0" w:color="BFC7D1"/>
@@ -13425,7 +13425,7 @@
         </w:tc>
         <w:tc>
           <w:tcPr>
-            <w:tcW w:w="1805" w:type="dxa"/>
+            <w:tcW w:w="2196" w:type="dxa"/>
             <w:tcBorders>
               <w:top w:val="single" w:sz="4" w:space="0" w:color="BFC7D1"/>
               <w:left w:val="single" w:sz="4" w:space="0" w:color="BFC7D1"/>
@@ -13462,7 +13462,7 @@
         </w:tc>
         <w:tc>
           <w:tcPr>
-            <w:tcW w:w="1805" w:type="dxa"/>
+            <w:tcW w:w="1618" w:type="dxa"/>
             <w:tcBorders>
               <w:top w:val="single" w:sz="4" w:space="0" w:color="BFC7D1"/>
               <w:left w:val="single" w:sz="4" w:space="0" w:color="BFC7D1"/>
@@ -13499,7 +13499,7 @@
         </w:tc>
         <w:tc>
           <w:tcPr>
-            <w:tcW w:w="1806" w:type="dxa"/>
+            <w:tcW w:w="1041" w:type="dxa"/>
             <w:tcBorders>
               <w:top w:val="single" w:sz="4" w:space="0" w:color="BFC7D1"/>
               <w:left w:val="single" w:sz="4" w:space="0" w:color="BFC7D1"/>
@@ -13568,7 +13568,7 @@
           <w:spacing w:val="0"/>
         </w:rPr>
       </w:pPr>
-      <w:bookmarkStart w:id="40" w:name="__RefHeading___Toc18987_1603226370"/>
+      <w:bookmarkStart w:id="40" w:name="__RefHeading___Toc38132_2679730275"/>
       <w:bookmarkStart w:id="41" w:name="_Toc233203395"/>
       <w:bookmarkEnd w:id="40"/>
       <w:r>

</xml_diff>